<commit_message>
Verify original evidence, recover storage faults and refresh contest materials
</commit_message>
<xml_diff>
--- a/delivery/01-design-report.docx
+++ b/delivery/01-design-report.docx
@@ -69,7 +69,7 @@
         <w:spacing w:after="160" w:line="300" w:lineRule="auto"/>
       </w:pPr>
       <w:r>
-        <w:t>核心亮点预览（一）：架构与证据</w:t>
+        <w:t>核心亮点预览 一 架构与证据</w:t>
       </w:r>
     </w:p>
     <w:p>
@@ -136,12 +136,21 @@
       <w:tblPr>
         <w:tblStyle w:val="LightShading-Accent1"/>
         <w:tblW w:type="auto" w:w="0"/>
+        <w:tblLayout w:type="fixed"/>
         <w:tblLook w:firstColumn="1" w:firstRow="1" w:lastColumn="0" w:lastRow="0" w:noHBand="0" w:noVBand="1" w:val="04A0"/>
+        <w:tblBorders>
+          <w:top w:val="single" w:sz="4" w:color="D9D9D9"/>
+          <w:left w:val="single" w:sz="4" w:color="D9D9D9"/>
+          <w:bottom w:val="single" w:sz="4" w:color="D9D9D9"/>
+          <w:right w:val="single" w:sz="4" w:color="D9D9D9"/>
+          <w:insideH w:val="single" w:sz="4" w:color="D9D9D9"/>
+          <w:insideV w:val="single" w:sz="4" w:color="D9D9D9"/>
+        </w:tblBorders>
       </w:tblPr>
       <w:tblGrid>
-        <w:gridCol w:w="3213"/>
-        <w:gridCol w:w="3213"/>
-        <w:gridCol w:w="3213"/>
+        <w:gridCol w:w="2154"/>
+        <w:gridCol w:w="3118"/>
+        <w:gridCol w:w="4365"/>
       </w:tblGrid>
       <w:tr>
         <w:trPr>
@@ -150,14 +159,24 @@
         </w:trPr>
         <w:tc>
           <w:tcPr>
-            <w:tcW w:type="dxa" w:w="3213"/>
+            <w:tcW w:type="dxa" w:w="2154"/>
+            <w:vAlign w:val="center"/>
+            <w:shd w:fill="172A3A"/>
+            <w:tcMar>
+              <w:top w:w="100" w:type="dxa"/>
+              <w:bottom w:w="100" w:type="dxa"/>
+              <w:left w:w="120" w:type="dxa"/>
+              <w:right w:w="120" w:type="dxa"/>
+            </w:tcMar>
           </w:tcPr>
           <w:p>
             <w:pPr>
+              <w:keepNext/>
               <w:spacing w:after="100" w:line="264" w:lineRule="auto"/>
             </w:pPr>
             <w:r>
               <w:rPr>
+                <w:color w:val="FFFFFF"/>
                 <w:sz w:val="18"/>
               </w:rPr>
               <w:t>当前验收</w:t>
@@ -166,14 +185,24 @@
         </w:tc>
         <w:tc>
           <w:tcPr>
-            <w:tcW w:type="dxa" w:w="3213"/>
+            <w:tcW w:type="dxa" w:w="3118"/>
+            <w:vAlign w:val="center"/>
+            <w:shd w:fill="172A3A"/>
+            <w:tcMar>
+              <w:top w:w="100" w:type="dxa"/>
+              <w:bottom w:w="100" w:type="dxa"/>
+              <w:left w:w="120" w:type="dxa"/>
+              <w:right w:w="120" w:type="dxa"/>
+            </w:tcMar>
           </w:tcPr>
           <w:p>
             <w:pPr>
+              <w:keepNext/>
               <w:spacing w:after="100" w:line="264" w:lineRule="auto"/>
             </w:pPr>
             <w:r>
               <w:rPr>
+                <w:color w:val="FFFFFF"/>
                 <w:sz w:val="18"/>
               </w:rPr>
               <w:t>结果</w:t>
@@ -182,14 +211,24 @@
         </w:tc>
         <w:tc>
           <w:tcPr>
-            <w:tcW w:type="dxa" w:w="3213"/>
+            <w:tcW w:type="dxa" w:w="4365"/>
+            <w:vAlign w:val="center"/>
+            <w:shd w:fill="172A3A"/>
+            <w:tcMar>
+              <w:top w:w="100" w:type="dxa"/>
+              <w:bottom w:w="100" w:type="dxa"/>
+              <w:left w:w="120" w:type="dxa"/>
+              <w:right w:w="120" w:type="dxa"/>
+            </w:tcMar>
           </w:tcPr>
           <w:p>
             <w:pPr>
+              <w:keepNext/>
               <w:spacing w:after="100" w:line="264" w:lineRule="auto"/>
             </w:pPr>
             <w:r>
               <w:rPr>
+                <w:color w:val="FFFFFF"/>
                 <w:sz w:val="18"/>
               </w:rPr>
               <w:t>口径</w:t>
@@ -203,7 +242,15 @@
         </w:trPr>
         <w:tc>
           <w:tcPr>
-            <w:tcW w:type="dxa" w:w="3213"/>
+            <w:tcW w:type="dxa" w:w="2154"/>
+            <w:vAlign w:val="center"/>
+            <w:shd w:fill="F3F6F8"/>
+            <w:tcMar>
+              <w:top w:w="100" w:type="dxa"/>
+              <w:bottom w:w="100" w:type="dxa"/>
+              <w:left w:w="120" w:type="dxa"/>
+              <w:right w:w="120" w:type="dxa"/>
+            </w:tcMar>
           </w:tcPr>
           <w:p>
             <w:pPr>
@@ -211,6 +258,7 @@
             </w:pPr>
             <w:r>
               <w:rPr>
+                <w:color w:val="000000"/>
                 <w:sz w:val="18"/>
               </w:rPr>
               <w:t>问数开发验收</w:t>
@@ -219,7 +267,15 @@
         </w:tc>
         <w:tc>
           <w:tcPr>
-            <w:tcW w:type="dxa" w:w="3213"/>
+            <w:tcW w:type="dxa" w:w="3118"/>
+            <w:vAlign w:val="center"/>
+            <w:shd w:fill="F3F6F8"/>
+            <w:tcMar>
+              <w:top w:w="100" w:type="dxa"/>
+              <w:bottom w:w="100" w:type="dxa"/>
+              <w:left w:w="120" w:type="dxa"/>
+              <w:right w:w="120" w:type="dxa"/>
+            </w:tcMar>
           </w:tcPr>
           <w:p>
             <w:pPr>
@@ -227,6 +283,7 @@
             </w:pPr>
             <w:r>
               <w:rPr>
+                <w:color w:val="000000"/>
                 <w:sz w:val="18"/>
               </w:rPr>
               <w:t>12/12</w:t>
@@ -235,7 +292,15 @@
         </w:tc>
         <w:tc>
           <w:tcPr>
-            <w:tcW w:type="dxa" w:w="3213"/>
+            <w:tcW w:type="dxa" w:w="4365"/>
+            <w:vAlign w:val="center"/>
+            <w:shd w:fill="F3F6F8"/>
+            <w:tcMar>
+              <w:top w:w="100" w:type="dxa"/>
+              <w:bottom w:w="100" w:type="dxa"/>
+              <w:left w:w="120" w:type="dxa"/>
+              <w:right w:w="120" w:type="dxa"/>
+            </w:tcMar>
           </w:tcPr>
           <w:p>
             <w:pPr>
@@ -243,6 +308,7 @@
             </w:pPr>
             <w:r>
               <w:rPr>
+                <w:color w:val="000000"/>
                 <w:sz w:val="18"/>
               </w:rPr>
               <w:t>规则规划、合成开发题</w:t>
@@ -256,7 +322,15 @@
         </w:trPr>
         <w:tc>
           <w:tcPr>
-            <w:tcW w:type="dxa" w:w="3213"/>
+            <w:tcW w:type="dxa" w:w="2154"/>
+            <w:vAlign w:val="center"/>
+            <w:shd w:fill="FFFFFF"/>
+            <w:tcMar>
+              <w:top w:w="100" w:type="dxa"/>
+              <w:bottom w:w="100" w:type="dxa"/>
+              <w:left w:w="120" w:type="dxa"/>
+              <w:right w:w="120" w:type="dxa"/>
+            </w:tcMar>
           </w:tcPr>
           <w:p>
             <w:pPr>
@@ -264,6 +338,7 @@
             </w:pPr>
             <w:r>
               <w:rPr>
+                <w:color w:val="000000"/>
                 <w:sz w:val="18"/>
               </w:rPr>
               <w:t>多格式问答开发验收</w:t>
@@ -272,7 +347,15 @@
         </w:tc>
         <w:tc>
           <w:tcPr>
-            <w:tcW w:type="dxa" w:w="3213"/>
+            <w:tcW w:type="dxa" w:w="3118"/>
+            <w:vAlign w:val="center"/>
+            <w:shd w:fill="FFFFFF"/>
+            <w:tcMar>
+              <w:top w:w="100" w:type="dxa"/>
+              <w:bottom w:w="100" w:type="dxa"/>
+              <w:left w:w="120" w:type="dxa"/>
+              <w:right w:w="120" w:type="dxa"/>
+            </w:tcMar>
           </w:tcPr>
           <w:p>
             <w:pPr>
@@ -280,6 +363,7 @@
             </w:pPr>
             <w:r>
               <w:rPr>
+                <w:color w:val="000000"/>
                 <w:sz w:val="18"/>
               </w:rPr>
               <w:t>11/11</w:t>
@@ -288,7 +372,15 @@
         </w:tc>
         <w:tc>
           <w:tcPr>
-            <w:tcW w:type="dxa" w:w="3213"/>
+            <w:tcW w:type="dxa" w:w="4365"/>
+            <w:vAlign w:val="center"/>
+            <w:shd w:fill="FFFFFF"/>
+            <w:tcMar>
+              <w:top w:w="100" w:type="dxa"/>
+              <w:bottom w:w="100" w:type="dxa"/>
+              <w:left w:w="120" w:type="dxa"/>
+              <w:right w:w="120" w:type="dxa"/>
+            </w:tcMar>
           </w:tcPr>
           <w:p>
             <w:pPr>
@@ -296,6 +388,7 @@
             </w:pPr>
             <w:r>
               <w:rPr>
+                <w:color w:val="000000"/>
                 <w:sz w:val="18"/>
               </w:rPr>
               <w:t>混合检索、原文摘录与引用核对</w:t>
@@ -309,7 +402,15 @@
         </w:trPr>
         <w:tc>
           <w:tcPr>
-            <w:tcW w:type="dxa" w:w="3213"/>
+            <w:tcW w:type="dxa" w:w="2154"/>
+            <w:vAlign w:val="center"/>
+            <w:shd w:fill="F3F6F8"/>
+            <w:tcMar>
+              <w:top w:w="100" w:type="dxa"/>
+              <w:bottom w:w="100" w:type="dxa"/>
+              <w:left w:w="120" w:type="dxa"/>
+              <w:right w:w="120" w:type="dxa"/>
+            </w:tcMar>
           </w:tcPr>
           <w:p>
             <w:pPr>
@@ -317,6 +418,7 @@
             </w:pPr>
             <w:r>
               <w:rPr>
+                <w:color w:val="000000"/>
                 <w:sz w:val="18"/>
               </w:rPr>
               <w:t>跨源工具链开发验收</w:t>
@@ -325,7 +427,15 @@
         </w:tc>
         <w:tc>
           <w:tcPr>
-            <w:tcW w:type="dxa" w:w="3213"/>
+            <w:tcW w:type="dxa" w:w="3118"/>
+            <w:vAlign w:val="center"/>
+            <w:shd w:fill="F3F6F8"/>
+            <w:tcMar>
+              <w:top w:w="100" w:type="dxa"/>
+              <w:bottom w:w="100" w:type="dxa"/>
+              <w:left w:w="120" w:type="dxa"/>
+              <w:right w:w="120" w:type="dxa"/>
+            </w:tcMar>
           </w:tcPr>
           <w:p>
             <w:pPr>
@@ -333,6 +443,7 @@
             </w:pPr>
             <w:r>
               <w:rPr>
+                <w:color w:val="000000"/>
                 <w:sz w:val="18"/>
               </w:rPr>
               <w:t>5/5</w:t>
@@ -341,7 +452,15 @@
         </w:tc>
         <w:tc>
           <w:tcPr>
-            <w:tcW w:type="dxa" w:w="3213"/>
+            <w:tcW w:type="dxa" w:w="4365"/>
+            <w:vAlign w:val="center"/>
+            <w:shd w:fill="F3F6F8"/>
+            <w:tcMar>
+              <w:top w:w="100" w:type="dxa"/>
+              <w:bottom w:w="100" w:type="dxa"/>
+              <w:left w:w="120" w:type="dxa"/>
+              <w:right w:w="120" w:type="dxa"/>
+            </w:tcMar>
           </w:tcPr>
           <w:p>
             <w:pPr>
@@ -349,6 +468,7 @@
             </w:pPr>
             <w:r>
               <w:rPr>
+                <w:color w:val="000000"/>
                 <w:sz w:val="18"/>
               </w:rPr>
               <w:t>明确工具计划，非未知模型规划</w:t>
@@ -362,7 +482,15 @@
         </w:trPr>
         <w:tc>
           <w:tcPr>
-            <w:tcW w:type="dxa" w:w="3213"/>
+            <w:tcW w:type="dxa" w:w="2154"/>
+            <w:vAlign w:val="center"/>
+            <w:shd w:fill="FFFFFF"/>
+            <w:tcMar>
+              <w:top w:w="100" w:type="dxa"/>
+              <w:bottom w:w="100" w:type="dxa"/>
+              <w:left w:w="120" w:type="dxa"/>
+              <w:right w:w="120" w:type="dxa"/>
+            </w:tcMar>
           </w:tcPr>
           <w:p>
             <w:pPr>
@@ -370,6 +498,7 @@
             </w:pPr>
             <w:r>
               <w:rPr>
+                <w:color w:val="000000"/>
                 <w:sz w:val="18"/>
               </w:rPr>
               <w:t>公开Chinook开发题</w:t>
@@ -378,7 +507,15 @@
         </w:tc>
         <w:tc>
           <w:tcPr>
-            <w:tcW w:type="dxa" w:w="3213"/>
+            <w:tcW w:type="dxa" w:w="3118"/>
+            <w:vAlign w:val="center"/>
+            <w:shd w:fill="FFFFFF"/>
+            <w:tcMar>
+              <w:top w:w="100" w:type="dxa"/>
+              <w:bottom w:w="100" w:type="dxa"/>
+              <w:left w:w="120" w:type="dxa"/>
+              <w:right w:w="120" w:type="dxa"/>
+            </w:tcMar>
           </w:tcPr>
           <w:p>
             <w:pPr>
@@ -386,6 +523,7 @@
             </w:pPr>
             <w:r>
               <w:rPr>
+                <w:color w:val="000000"/>
                 <w:sz w:val="18"/>
               </w:rPr>
               <w:t>12/12</w:t>
@@ -394,7 +532,15 @@
         </w:tc>
         <w:tc>
           <w:tcPr>
-            <w:tcW w:type="dxa" w:w="3213"/>
+            <w:tcW w:type="dxa" w:w="4365"/>
+            <w:vAlign w:val="center"/>
+            <w:shd w:fill="FFFFFF"/>
+            <w:tcMar>
+              <w:top w:w="100" w:type="dxa"/>
+              <w:bottom w:w="100" w:type="dxa"/>
+              <w:left w:w="120" w:type="dxa"/>
+              <w:right w:w="120" w:type="dxa"/>
+            </w:tcMar>
           </w:tcPr>
           <w:p>
             <w:pPr>
@@ -402,6 +548,7 @@
             </w:pPr>
             <w:r>
               <w:rPr>
+                <w:color w:val="000000"/>
                 <w:sz w:val="18"/>
               </w:rPr>
               <w:t>公开库，人工题，非Spider基准</w:t>
@@ -415,7 +562,15 @@
         </w:trPr>
         <w:tc>
           <w:tcPr>
-            <w:tcW w:type="dxa" w:w="3213"/>
+            <w:tcW w:type="dxa" w:w="2154"/>
+            <w:vAlign w:val="center"/>
+            <w:shd w:fill="F3F6F8"/>
+            <w:tcMar>
+              <w:top w:w="100" w:type="dxa"/>
+              <w:bottom w:w="100" w:type="dxa"/>
+              <w:left w:w="120" w:type="dxa"/>
+              <w:right w:w="120" w:type="dxa"/>
+            </w:tcMar>
           </w:tcPr>
           <w:p>
             <w:pPr>
@@ -423,6 +578,87 @@
             </w:pPr>
             <w:r>
               <w:rPr>
+                <w:color w:val="000000"/>
+                <w:sz w:val="18"/>
+              </w:rPr>
+              <w:t>实际故障开发审计</w:t>
+            </w:r>
+          </w:p>
+        </w:tc>
+        <w:tc>
+          <w:tcPr>
+            <w:tcW w:type="dxa" w:w="3118"/>
+            <w:vAlign w:val="center"/>
+            <w:shd w:fill="F3F6F8"/>
+            <w:tcMar>
+              <w:top w:w="100" w:type="dxa"/>
+              <w:bottom w:w="100" w:type="dxa"/>
+              <w:left w:w="120" w:type="dxa"/>
+              <w:right w:w="120" w:type="dxa"/>
+            </w:tcMar>
+          </w:tcPr>
+          <w:p>
+            <w:pPr>
+              <w:spacing w:after="100" w:line="264" w:lineRule="auto"/>
+            </w:pPr>
+            <w:r>
+              <w:rPr>
+                <w:color w:val="000000"/>
+                <w:sz w:val="18"/>
+              </w:rPr>
+              <w:t>4/10 → 10/10</w:t>
+            </w:r>
+          </w:p>
+        </w:tc>
+        <w:tc>
+          <w:tcPr>
+            <w:tcW w:type="dxa" w:w="4365"/>
+            <w:vAlign w:val="center"/>
+            <w:shd w:fill="F3F6F8"/>
+            <w:tcMar>
+              <w:top w:w="100" w:type="dxa"/>
+              <w:bottom w:w="100" w:type="dxa"/>
+              <w:left w:w="120" w:type="dxa"/>
+              <w:right w:w="120" w:type="dxa"/>
+            </w:tcMar>
+          </w:tcPr>
+          <w:p>
+            <w:pPr>
+              <w:spacing w:after="100" w:line="264" w:lineRule="auto"/>
+            </w:pPr>
+            <w:r>
+              <w:rPr>
+                <w:color w:val="000000"/>
+                <w:sz w:val="18"/>
+              </w:rPr>
+              <w:t>临时文件/数据库/HTTP子服务，首次失败保留</w:t>
+            </w:r>
+          </w:p>
+        </w:tc>
+      </w:tr>
+      <w:tr>
+        <w:trPr>
+          <w:cantSplit/>
+        </w:trPr>
+        <w:tc>
+          <w:tcPr>
+            <w:tcW w:type="dxa" w:w="2154"/>
+            <w:vAlign w:val="center"/>
+            <w:shd w:fill="FFFFFF"/>
+            <w:tcMar>
+              <w:top w:w="100" w:type="dxa"/>
+              <w:bottom w:w="100" w:type="dxa"/>
+              <w:left w:w="120" w:type="dxa"/>
+              <w:right w:w="120" w:type="dxa"/>
+            </w:tcMar>
+          </w:tcPr>
+          <w:p>
+            <w:pPr>
+              <w:spacing w:after="100" w:line="264" w:lineRule="auto"/>
+            </w:pPr>
+            <w:r>
+              <w:rPr>
+                <w:color w:val="000000"/>
                 <w:sz w:val="18"/>
               </w:rPr>
               <w:t>真实gpt-6-luna</w:t>
@@ -431,7 +667,15 @@
         </w:tc>
         <w:tc>
           <w:tcPr>
-            <w:tcW w:type="dxa" w:w="3213"/>
+            <w:tcW w:type="dxa" w:w="3118"/>
+            <w:vAlign w:val="center"/>
+            <w:shd w:fill="FFFFFF"/>
+            <w:tcMar>
+              <w:top w:w="100" w:type="dxa"/>
+              <w:bottom w:w="100" w:type="dxa"/>
+              <w:left w:w="120" w:type="dxa"/>
+              <w:right w:w="120" w:type="dxa"/>
+            </w:tcMar>
           </w:tcPr>
           <w:p>
             <w:pPr>
@@ -439,6 +683,7 @@
             </w:pPr>
             <w:r>
               <w:rPr>
+                <w:color w:val="000000"/>
                 <w:sz w:val="18"/>
               </w:rPr>
               <w:t>authentication_failed</w:t>
@@ -447,7 +692,15 @@
         </w:tc>
         <w:tc>
           <w:tcPr>
-            <w:tcW w:type="dxa" w:w="3213"/>
+            <w:tcW w:type="dxa" w:w="4365"/>
+            <w:vAlign w:val="center"/>
+            <w:shd w:fill="FFFFFF"/>
+            <w:tcMar>
+              <w:top w:w="100" w:type="dxa"/>
+              <w:bottom w:w="100" w:type="dxa"/>
+              <w:left w:w="120" w:type="dxa"/>
+              <w:right w:w="120" w:type="dxa"/>
+            </w:tcMar>
           </w:tcPr>
           <w:p>
             <w:pPr>
@@ -455,6 +708,7 @@
             </w:pPr>
             <w:r>
               <w:rPr>
+                <w:color w:val="000000"/>
                 <w:sz w:val="18"/>
               </w:rPr>
               <w:t>models及responses探测401，未有模型成绩</w:t>
@@ -474,19 +728,28 @@
         <w:spacing w:after="160" w:line="300" w:lineRule="auto"/>
       </w:pPr>
       <w:r>
-        <w:t>核心亮点预览（二）：中级任务覆盖</w:t>
+        <w:t>核心亮点预览 二 中级任务覆盖</w:t>
       </w:r>
     </w:p>
     <w:tbl>
       <w:tblPr>
         <w:tblStyle w:val="LightShading-Accent1"/>
         <w:tblW w:type="auto" w:w="0"/>
+        <w:tblLayout w:type="fixed"/>
         <w:tblLook w:firstColumn="1" w:firstRow="1" w:lastColumn="0" w:lastRow="0" w:noHBand="0" w:noVBand="1" w:val="04A0"/>
+        <w:tblBorders>
+          <w:top w:val="single" w:sz="4" w:color="D9D9D9"/>
+          <w:left w:val="single" w:sz="4" w:color="D9D9D9"/>
+          <w:bottom w:val="single" w:sz="4" w:color="D9D9D9"/>
+          <w:right w:val="single" w:sz="4" w:color="D9D9D9"/>
+          <w:insideH w:val="single" w:sz="4" w:color="D9D9D9"/>
+          <w:insideV w:val="single" w:sz="4" w:color="D9D9D9"/>
+        </w:tblBorders>
       </w:tblPr>
       <w:tblGrid>
-        <w:gridCol w:w="3213"/>
-        <w:gridCol w:w="3213"/>
-        <w:gridCol w:w="3213"/>
+        <w:gridCol w:w="850"/>
+        <w:gridCol w:w="3118"/>
+        <w:gridCol w:w="5669"/>
       </w:tblGrid>
       <w:tr>
         <w:trPr>
@@ -495,14 +758,24 @@
         </w:trPr>
         <w:tc>
           <w:tcPr>
-            <w:tcW w:type="dxa" w:w="3213"/>
+            <w:tcW w:type="dxa" w:w="850"/>
+            <w:vAlign w:val="center"/>
+            <w:shd w:fill="172A3A"/>
+            <w:tcMar>
+              <w:top w:w="100" w:type="dxa"/>
+              <w:bottom w:w="100" w:type="dxa"/>
+              <w:left w:w="120" w:type="dxa"/>
+              <w:right w:w="120" w:type="dxa"/>
+            </w:tcMar>
           </w:tcPr>
           <w:p>
             <w:pPr>
+              <w:keepNext/>
               <w:spacing w:after="100" w:line="264" w:lineRule="auto"/>
             </w:pPr>
             <w:r>
               <w:rPr>
+                <w:color w:val="FFFFFF"/>
                 <w:sz w:val="18"/>
               </w:rPr>
               <w:t>要求</w:t>
@@ -511,14 +784,24 @@
         </w:tc>
         <w:tc>
           <w:tcPr>
-            <w:tcW w:type="dxa" w:w="3213"/>
+            <w:tcW w:type="dxa" w:w="3118"/>
+            <w:vAlign w:val="center"/>
+            <w:shd w:fill="172A3A"/>
+            <w:tcMar>
+              <w:top w:w="100" w:type="dxa"/>
+              <w:bottom w:w="100" w:type="dxa"/>
+              <w:left w:w="120" w:type="dxa"/>
+              <w:right w:w="120" w:type="dxa"/>
+            </w:tcMar>
           </w:tcPr>
           <w:p>
             <w:pPr>
+              <w:keepNext/>
               <w:spacing w:after="100" w:line="264" w:lineRule="auto"/>
             </w:pPr>
             <w:r>
               <w:rPr>
+                <w:color w:val="FFFFFF"/>
                 <w:sz w:val="18"/>
               </w:rPr>
               <w:t>能力</w:t>
@@ -527,14 +810,24 @@
         </w:tc>
         <w:tc>
           <w:tcPr>
-            <w:tcW w:type="dxa" w:w="3213"/>
+            <w:tcW w:type="dxa" w:w="5669"/>
+            <w:vAlign w:val="center"/>
+            <w:shd w:fill="172A3A"/>
+            <w:tcMar>
+              <w:top w:w="100" w:type="dxa"/>
+              <w:bottom w:w="100" w:type="dxa"/>
+              <w:left w:w="120" w:type="dxa"/>
+              <w:right w:w="120" w:type="dxa"/>
+            </w:tcMar>
           </w:tcPr>
           <w:p>
             <w:pPr>
+              <w:keepNext/>
               <w:spacing w:after="100" w:line="264" w:lineRule="auto"/>
             </w:pPr>
             <w:r>
               <w:rPr>
+                <w:color w:val="FFFFFF"/>
                 <w:sz w:val="18"/>
               </w:rPr>
               <w:t>当前证据</w:t>
@@ -548,7 +841,15 @@
         </w:trPr>
         <w:tc>
           <w:tcPr>
-            <w:tcW w:type="dxa" w:w="3213"/>
+            <w:tcW w:type="dxa" w:w="850"/>
+            <w:vAlign w:val="center"/>
+            <w:shd w:fill="F3F6F8"/>
+            <w:tcMar>
+              <w:top w:w="100" w:type="dxa"/>
+              <w:bottom w:w="100" w:type="dxa"/>
+              <w:left w:w="120" w:type="dxa"/>
+              <w:right w:w="120" w:type="dxa"/>
+            </w:tcMar>
           </w:tcPr>
           <w:p>
             <w:pPr>
@@ -556,6 +857,7 @@
             </w:pPr>
             <w:r>
               <w:rPr>
+                <w:color w:val="000000"/>
                 <w:sz w:val="18"/>
               </w:rPr>
               <w:t>M01</w:t>
@@ -564,7 +866,15 @@
         </w:tc>
         <w:tc>
           <w:tcPr>
-            <w:tcW w:type="dxa" w:w="3213"/>
+            <w:tcW w:type="dxa" w:w="3118"/>
+            <w:vAlign w:val="center"/>
+            <w:shd w:fill="F3F6F8"/>
+            <w:tcMar>
+              <w:top w:w="100" w:type="dxa"/>
+              <w:bottom w:w="100" w:type="dxa"/>
+              <w:left w:w="120" w:type="dxa"/>
+              <w:right w:w="120" w:type="dxa"/>
+            </w:tcMar>
           </w:tcPr>
           <w:p>
             <w:pPr>
@@ -572,6 +882,7 @@
             </w:pPr>
             <w:r>
               <w:rPr>
+                <w:color w:val="000000"/>
                 <w:sz w:val="18"/>
               </w:rPr>
               <w:t>要素识别、别名与改写</w:t>
@@ -580,7 +891,15 @@
         </w:tc>
         <w:tc>
           <w:tcPr>
-            <w:tcW w:type="dxa" w:w="3213"/>
+            <w:tcW w:type="dxa" w:w="5669"/>
+            <w:vAlign w:val="center"/>
+            <w:shd w:fill="F3F6F8"/>
+            <w:tcMar>
+              <w:top w:w="100" w:type="dxa"/>
+              <w:bottom w:w="100" w:type="dxa"/>
+              <w:left w:w="120" w:type="dxa"/>
+              <w:right w:w="120" w:type="dxa"/>
+            </w:tcMar>
           </w:tcPr>
           <w:p>
             <w:pPr>
@@ -588,6 +907,7 @@
             </w:pPr>
             <w:r>
               <w:rPr>
+                <w:color w:val="000000"/>
                 <w:sz w:val="18"/>
               </w:rPr>
               <w:t>NFKC、值词边界、5/5文本扰动</w:t>
@@ -601,7 +921,15 @@
         </w:trPr>
         <w:tc>
           <w:tcPr>
-            <w:tcW w:type="dxa" w:w="3213"/>
+            <w:tcW w:type="dxa" w:w="850"/>
+            <w:vAlign w:val="center"/>
+            <w:shd w:fill="FFFFFF"/>
+            <w:tcMar>
+              <w:top w:w="100" w:type="dxa"/>
+              <w:bottom w:w="100" w:type="dxa"/>
+              <w:left w:w="120" w:type="dxa"/>
+              <w:right w:w="120" w:type="dxa"/>
+            </w:tcMar>
           </w:tcPr>
           <w:p>
             <w:pPr>
@@ -609,6 +937,7 @@
             </w:pPr>
             <w:r>
               <w:rPr>
+                <w:color w:val="000000"/>
                 <w:sz w:val="18"/>
               </w:rPr>
               <w:t>M02</w:t>
@@ -617,7 +946,15 @@
         </w:tc>
         <w:tc>
           <w:tcPr>
-            <w:tcW w:type="dxa" w:w="3213"/>
+            <w:tcW w:type="dxa" w:w="3118"/>
+            <w:vAlign w:val="center"/>
+            <w:shd w:fill="FFFFFF"/>
+            <w:tcMar>
+              <w:top w:w="100" w:type="dxa"/>
+              <w:bottom w:w="100" w:type="dxa"/>
+              <w:left w:w="120" w:type="dxa"/>
+              <w:right w:w="120" w:type="dxa"/>
+            </w:tcMar>
           </w:tcPr>
           <w:p>
             <w:pPr>
@@ -625,6 +962,7 @@
             </w:pPr>
             <w:r>
               <w:rPr>
+                <w:color w:val="000000"/>
                 <w:sz w:val="18"/>
               </w:rPr>
               <w:t>低示例跨领域</w:t>
@@ -633,7 +971,15 @@
         </w:tc>
         <w:tc>
           <w:tcPr>
-            <w:tcW w:type="dxa" w:w="3213"/>
+            <w:tcW w:type="dxa" w:w="5669"/>
+            <w:vAlign w:val="center"/>
+            <w:shd w:fill="FFFFFF"/>
+            <w:tcMar>
+              <w:top w:w="100" w:type="dxa"/>
+              <w:bottom w:w="100" w:type="dxa"/>
+              <w:left w:w="120" w:type="dxa"/>
+              <w:right w:w="120" w:type="dxa"/>
+            </w:tcMar>
           </w:tcPr>
           <w:p>
             <w:pPr>
@@ -641,6 +987,7 @@
             </w:pPr>
             <w:r>
               <w:rPr>
+                <w:color w:val="000000"/>
                 <w:sz w:val="18"/>
               </w:rPr>
               <w:t>Chinook 11表、0 few-shot，开发题12/12</w:t>
@@ -654,7 +1001,15 @@
         </w:trPr>
         <w:tc>
           <w:tcPr>
-            <w:tcW w:type="dxa" w:w="3213"/>
+            <w:tcW w:type="dxa" w:w="850"/>
+            <w:vAlign w:val="center"/>
+            <w:shd w:fill="F3F6F8"/>
+            <w:tcMar>
+              <w:top w:w="100" w:type="dxa"/>
+              <w:bottom w:w="100" w:type="dxa"/>
+              <w:left w:w="120" w:type="dxa"/>
+              <w:right w:w="120" w:type="dxa"/>
+            </w:tcMar>
           </w:tcPr>
           <w:p>
             <w:pPr>
@@ -662,6 +1017,7 @@
             </w:pPr>
             <w:r>
               <w:rPr>
+                <w:color w:val="000000"/>
                 <w:sz w:val="18"/>
               </w:rPr>
               <w:t>M03</w:t>
@@ -670,7 +1026,15 @@
         </w:tc>
         <w:tc>
           <w:tcPr>
-            <w:tcW w:type="dxa" w:w="3213"/>
+            <w:tcW w:type="dxa" w:w="3118"/>
+            <w:vAlign w:val="center"/>
+            <w:shd w:fill="F3F6F8"/>
+            <w:tcMar>
+              <w:top w:w="100" w:type="dxa"/>
+              <w:bottom w:w="100" w:type="dxa"/>
+              <w:left w:w="120" w:type="dxa"/>
+              <w:right w:w="120" w:type="dxa"/>
+            </w:tcMar>
           </w:tcPr>
           <w:p>
             <w:pPr>
@@ -678,6 +1042,7 @@
             </w:pPr>
             <w:r>
               <w:rPr>
+                <w:color w:val="000000"/>
                 <w:sz w:val="18"/>
               </w:rPr>
               <w:t>主动澄清</w:t>
@@ -686,7 +1051,15 @@
         </w:tc>
         <w:tc>
           <w:tcPr>
-            <w:tcW w:type="dxa" w:w="3213"/>
+            <w:tcW w:type="dxa" w:w="5669"/>
+            <w:vAlign w:val="center"/>
+            <w:shd w:fill="F3F6F8"/>
+            <w:tcMar>
+              <w:top w:w="100" w:type="dxa"/>
+              <w:bottom w:w="100" w:type="dxa"/>
+              <w:left w:w="120" w:type="dxa"/>
+              <w:right w:w="120" w:type="dxa"/>
+            </w:tcMar>
           </w:tcPr>
           <w:p>
             <w:pPr>
@@ -694,6 +1067,7 @@
             </w:pPr>
             <w:r>
               <w:rPr>
+                <w:color w:val="000000"/>
                 <w:sz w:val="18"/>
               </w:rPr>
               <w:t>指标、时间、值、JOIN歧义与回填</w:t>
@@ -707,7 +1081,15 @@
         </w:trPr>
         <w:tc>
           <w:tcPr>
-            <w:tcW w:type="dxa" w:w="3213"/>
+            <w:tcW w:type="dxa" w:w="850"/>
+            <w:vAlign w:val="center"/>
+            <w:shd w:fill="FFFFFF"/>
+            <w:tcMar>
+              <w:top w:w="100" w:type="dxa"/>
+              <w:bottom w:w="100" w:type="dxa"/>
+              <w:left w:w="120" w:type="dxa"/>
+              <w:right w:w="120" w:type="dxa"/>
+            </w:tcMar>
           </w:tcPr>
           <w:p>
             <w:pPr>
@@ -715,6 +1097,7 @@
             </w:pPr>
             <w:r>
               <w:rPr>
+                <w:color w:val="000000"/>
                 <w:sz w:val="18"/>
               </w:rPr>
               <w:t>M04</w:t>
@@ -723,7 +1106,15 @@
         </w:tc>
         <w:tc>
           <w:tcPr>
-            <w:tcW w:type="dxa" w:w="3213"/>
+            <w:tcW w:type="dxa" w:w="3118"/>
+            <w:vAlign w:val="center"/>
+            <w:shd w:fill="FFFFFF"/>
+            <w:tcMar>
+              <w:top w:w="100" w:type="dxa"/>
+              <w:bottom w:w="100" w:type="dxa"/>
+              <w:left w:w="120" w:type="dxa"/>
+              <w:right w:w="120" w:type="dxa"/>
+            </w:tcMar>
           </w:tcPr>
           <w:p>
             <w:pPr>
@@ -731,6 +1122,7 @@
             </w:pPr>
             <w:r>
               <w:rPr>
+                <w:color w:val="000000"/>
                 <w:sz w:val="18"/>
               </w:rPr>
               <w:t>数十表Schema Linking</w:t>
@@ -739,7 +1131,15 @@
         </w:tc>
         <w:tc>
           <w:tcPr>
-            <w:tcW w:type="dxa" w:w="3213"/>
+            <w:tcW w:type="dxa" w:w="5669"/>
+            <w:vAlign w:val="center"/>
+            <w:shd w:fill="FFFFFF"/>
+            <w:tcMar>
+              <w:top w:w="100" w:type="dxa"/>
+              <w:bottom w:w="100" w:type="dxa"/>
+              <w:left w:w="120" w:type="dxa"/>
+              <w:right w:w="120" w:type="dxa"/>
+            </w:tcMar>
           </w:tcPr>
           <w:p>
             <w:pPr>
@@ -747,6 +1147,7 @@
             </w:pPr>
             <w:r>
               <w:rPr>
+                <w:color w:val="000000"/>
                 <w:sz w:val="18"/>
               </w:rPr>
               <w:t>11/40/80表干扰，9/9开发案例</w:t>
@@ -760,7 +1161,15 @@
         </w:trPr>
         <w:tc>
           <w:tcPr>
-            <w:tcW w:type="dxa" w:w="3213"/>
+            <w:tcW w:type="dxa" w:w="850"/>
+            <w:vAlign w:val="center"/>
+            <w:shd w:fill="F3F6F8"/>
+            <w:tcMar>
+              <w:top w:w="100" w:type="dxa"/>
+              <w:bottom w:w="100" w:type="dxa"/>
+              <w:left w:w="120" w:type="dxa"/>
+              <w:right w:w="120" w:type="dxa"/>
+            </w:tcMar>
           </w:tcPr>
           <w:p>
             <w:pPr>
@@ -768,6 +1177,7 @@
             </w:pPr>
             <w:r>
               <w:rPr>
+                <w:color w:val="000000"/>
                 <w:sz w:val="18"/>
               </w:rPr>
               <w:t>M05</w:t>
@@ -776,7 +1186,15 @@
         </w:tc>
         <w:tc>
           <w:tcPr>
-            <w:tcW w:type="dxa" w:w="3213"/>
+            <w:tcW w:type="dxa" w:w="3118"/>
+            <w:vAlign w:val="center"/>
+            <w:shd w:fill="F3F6F8"/>
+            <w:tcMar>
+              <w:top w:w="100" w:type="dxa"/>
+              <w:bottom w:w="100" w:type="dxa"/>
+              <w:left w:w="120" w:type="dxa"/>
+              <w:right w:w="120" w:type="dxa"/>
+            </w:tcMar>
           </w:tcPr>
           <w:p>
             <w:pPr>
@@ -784,6 +1202,7 @@
             </w:pPr>
             <w:r>
               <w:rPr>
+                <w:color w:val="000000"/>
                 <w:sz w:val="18"/>
               </w:rPr>
               <w:t>JOIN、聚合、嵌套</w:t>
@@ -792,7 +1211,15 @@
         </w:tc>
         <w:tc>
           <w:tcPr>
-            <w:tcW w:type="dxa" w:w="3213"/>
+            <w:tcW w:type="dxa" w:w="5669"/>
+            <w:vAlign w:val="center"/>
+            <w:shd w:fill="F3F6F8"/>
+            <w:tcMar>
+              <w:top w:w="100" w:type="dxa"/>
+              <w:bottom w:w="100" w:type="dxa"/>
+              <w:left w:w="120" w:type="dxa"/>
+              <w:right w:w="120" w:type="dxa"/>
+            </w:tcMar>
           </w:tcPr>
           <w:p>
             <w:pPr>
@@ -800,6 +1227,7 @@
             </w:pPr>
             <w:r>
               <w:rPr>
+                <w:color w:val="000000"/>
                 <w:sz w:val="18"/>
               </w:rPr>
               <w:t>关系图、复合键、粒度与防扇出</w:t>
@@ -813,7 +1241,15 @@
         </w:trPr>
         <w:tc>
           <w:tcPr>
-            <w:tcW w:type="dxa" w:w="3213"/>
+            <w:tcW w:type="dxa" w:w="850"/>
+            <w:vAlign w:val="center"/>
+            <w:shd w:fill="FFFFFF"/>
+            <w:tcMar>
+              <w:top w:w="100" w:type="dxa"/>
+              <w:bottom w:w="100" w:type="dxa"/>
+              <w:left w:w="120" w:type="dxa"/>
+              <w:right w:w="120" w:type="dxa"/>
+            </w:tcMar>
           </w:tcPr>
           <w:p>
             <w:pPr>
@@ -821,6 +1257,7 @@
             </w:pPr>
             <w:r>
               <w:rPr>
+                <w:color w:val="000000"/>
                 <w:sz w:val="18"/>
               </w:rPr>
               <w:t>M06</w:t>
@@ -829,7 +1266,15 @@
         </w:tc>
         <w:tc>
           <w:tcPr>
-            <w:tcW w:type="dxa" w:w="3213"/>
+            <w:tcW w:type="dxa" w:w="3118"/>
+            <w:vAlign w:val="center"/>
+            <w:shd w:fill="FFFFFF"/>
+            <w:tcMar>
+              <w:top w:w="100" w:type="dxa"/>
+              <w:bottom w:w="100" w:type="dxa"/>
+              <w:left w:w="120" w:type="dxa"/>
+              <w:right w:w="120" w:type="dxa"/>
+            </w:tcMar>
           </w:tcPr>
           <w:p>
             <w:pPr>
@@ -837,6 +1282,7 @@
             </w:pPr>
             <w:r>
               <w:rPr>
+                <w:color w:val="000000"/>
                 <w:sz w:val="18"/>
               </w:rPr>
               <w:t>文档公式与数据结合</w:t>
@@ -845,7 +1291,15 @@
         </w:tc>
         <w:tc>
           <w:tcPr>
-            <w:tcW w:type="dxa" w:w="3213"/>
+            <w:tcW w:type="dxa" w:w="5669"/>
+            <w:vAlign w:val="center"/>
+            <w:shd w:fill="FFFFFF"/>
+            <w:tcMar>
+              <w:top w:w="100" w:type="dxa"/>
+              <w:bottom w:w="100" w:type="dxa"/>
+              <w:left w:w="120" w:type="dxa"/>
+              <w:right w:w="120" w:type="dxa"/>
+            </w:tcMar>
           </w:tcPr>
           <w:p>
             <w:pPr>
@@ -853,6 +1307,7 @@
             </w:pPr>
             <w:r>
               <w:rPr>
+                <w:color w:val="000000"/>
                 <w:sz w:val="18"/>
               </w:rPr>
               <w:t>AST、来源绑定、单位与预测年份守卫</w:t>
@@ -866,7 +1321,15 @@
         </w:trPr>
         <w:tc>
           <w:tcPr>
-            <w:tcW w:type="dxa" w:w="3213"/>
+            <w:tcW w:type="dxa" w:w="850"/>
+            <w:vAlign w:val="center"/>
+            <w:shd w:fill="F3F6F8"/>
+            <w:tcMar>
+              <w:top w:w="100" w:type="dxa"/>
+              <w:bottom w:w="100" w:type="dxa"/>
+              <w:left w:w="120" w:type="dxa"/>
+              <w:right w:w="120" w:type="dxa"/>
+            </w:tcMar>
           </w:tcPr>
           <w:p>
             <w:pPr>
@@ -874,6 +1337,7 @@
             </w:pPr>
             <w:r>
               <w:rPr>
+                <w:color w:val="000000"/>
                 <w:sz w:val="18"/>
               </w:rPr>
               <w:t>M07</w:t>
@@ -882,7 +1346,15 @@
         </w:tc>
         <w:tc>
           <w:tcPr>
-            <w:tcW w:type="dxa" w:w="3213"/>
+            <w:tcW w:type="dxa" w:w="3118"/>
+            <w:vAlign w:val="center"/>
+            <w:shd w:fill="F3F6F8"/>
+            <w:tcMar>
+              <w:top w:w="100" w:type="dxa"/>
+              <w:bottom w:w="100" w:type="dxa"/>
+              <w:left w:w="120" w:type="dxa"/>
+              <w:right w:w="120" w:type="dxa"/>
+            </w:tcMar>
           </w:tcPr>
           <w:p>
             <w:pPr>
@@ -890,6 +1362,7 @@
             </w:pPr>
             <w:r>
               <w:rPr>
+                <w:color w:val="000000"/>
                 <w:sz w:val="18"/>
               </w:rPr>
               <w:t>非标准目录</w:t>
@@ -898,7 +1371,15 @@
         </w:tc>
         <w:tc>
           <w:tcPr>
-            <w:tcW w:type="dxa" w:w="3213"/>
+            <w:tcW w:type="dxa" w:w="5669"/>
+            <w:vAlign w:val="center"/>
+            <w:shd w:fill="F3F6F8"/>
+            <w:tcMar>
+              <w:top w:w="100" w:type="dxa"/>
+              <w:bottom w:w="100" w:type="dxa"/>
+              <w:left w:w="120" w:type="dxa"/>
+              <w:right w:w="120" w:type="dxa"/>
+            </w:tcMar>
           </w:tcPr>
           <w:p>
             <w:pPr>
@@ -906,9 +1387,10 @@
             </w:pPr>
             <w:r>
               <w:rPr>
+                <w:color w:val="000000"/>
                 <w:sz w:val="18"/>
               </w:rPr>
-              <w:t>层级标题、行号、跳跃告警</w:t>
+              <w:t>8份实际PDF首次2/8→8/8；原文件行号</w:t>
             </w:r>
           </w:p>
         </w:tc>
@@ -919,7 +1401,15 @@
         </w:trPr>
         <w:tc>
           <w:tcPr>
-            <w:tcW w:type="dxa" w:w="3213"/>
+            <w:tcW w:type="dxa" w:w="850"/>
+            <w:vAlign w:val="center"/>
+            <w:shd w:fill="FFFFFF"/>
+            <w:tcMar>
+              <w:top w:w="100" w:type="dxa"/>
+              <w:bottom w:w="100" w:type="dxa"/>
+              <w:left w:w="120" w:type="dxa"/>
+              <w:right w:w="120" w:type="dxa"/>
+            </w:tcMar>
           </w:tcPr>
           <w:p>
             <w:pPr>
@@ -927,6 +1417,7 @@
             </w:pPr>
             <w:r>
               <w:rPr>
+                <w:color w:val="000000"/>
                 <w:sz w:val="18"/>
               </w:rPr>
               <w:t>M08</w:t>
@@ -935,7 +1426,15 @@
         </w:tc>
         <w:tc>
           <w:tcPr>
-            <w:tcW w:type="dxa" w:w="3213"/>
+            <w:tcW w:type="dxa" w:w="3118"/>
+            <w:vAlign w:val="center"/>
+            <w:shd w:fill="FFFFFF"/>
+            <w:tcMar>
+              <w:top w:w="100" w:type="dxa"/>
+              <w:bottom w:w="100" w:type="dxa"/>
+              <w:left w:w="120" w:type="dxa"/>
+              <w:right w:w="120" w:type="dxa"/>
+            </w:tcMar>
           </w:tcPr>
           <w:p>
             <w:pPr>
@@ -943,6 +1442,7 @@
             </w:pPr>
             <w:r>
               <w:rPr>
+                <w:color w:val="000000"/>
                 <w:sz w:val="18"/>
               </w:rPr>
               <w:t>复杂度自适应</w:t>
@@ -951,7 +1451,15 @@
         </w:tc>
         <w:tc>
           <w:tcPr>
-            <w:tcW w:type="dxa" w:w="3213"/>
+            <w:tcW w:type="dxa" w:w="5669"/>
+            <w:vAlign w:val="center"/>
+            <w:shd w:fill="FFFFFF"/>
+            <w:tcMar>
+              <w:top w:w="100" w:type="dxa"/>
+              <w:bottom w:w="100" w:type="dxa"/>
+              <w:left w:w="120" w:type="dxa"/>
+              <w:right w:w="120" w:type="dxa"/>
+            </w:tcMar>
           </w:tcPr>
           <w:p>
             <w:pPr>
@@ -959,6 +1467,7 @@
             </w:pPr>
             <w:r>
               <w:rPr>
+                <w:color w:val="000000"/>
                 <w:sz w:val="18"/>
               </w:rPr>
               <w:t>PageSignal及900字/80重叠复杂切片</w:t>
@@ -972,7 +1481,15 @@
         </w:trPr>
         <w:tc>
           <w:tcPr>
-            <w:tcW w:type="dxa" w:w="3213"/>
+            <w:tcW w:type="dxa" w:w="850"/>
+            <w:vAlign w:val="center"/>
+            <w:shd w:fill="F3F6F8"/>
+            <w:tcMar>
+              <w:top w:w="100" w:type="dxa"/>
+              <w:bottom w:w="100" w:type="dxa"/>
+              <w:left w:w="120" w:type="dxa"/>
+              <w:right w:w="120" w:type="dxa"/>
+            </w:tcMar>
           </w:tcPr>
           <w:p>
             <w:pPr>
@@ -980,6 +1497,7 @@
             </w:pPr>
             <w:r>
               <w:rPr>
+                <w:color w:val="000000"/>
                 <w:sz w:val="18"/>
               </w:rPr>
               <w:t>M09</w:t>
@@ -988,7 +1506,15 @@
         </w:tc>
         <w:tc>
           <w:tcPr>
-            <w:tcW w:type="dxa" w:w="3213"/>
+            <w:tcW w:type="dxa" w:w="3118"/>
+            <w:vAlign w:val="center"/>
+            <w:shd w:fill="F3F6F8"/>
+            <w:tcMar>
+              <w:top w:w="100" w:type="dxa"/>
+              <w:bottom w:w="100" w:type="dxa"/>
+              <w:left w:w="120" w:type="dxa"/>
+              <w:right w:w="120" w:type="dxa"/>
+            </w:tcMar>
           </w:tcPr>
           <w:p>
             <w:pPr>
@@ -996,6 +1522,7 @@
             </w:pPr>
             <w:r>
               <w:rPr>
+                <w:color w:val="000000"/>
                 <w:sz w:val="18"/>
               </w:rPr>
               <w:t>低质OCR恢复</w:t>
@@ -1004,7 +1531,15 @@
         </w:tc>
         <w:tc>
           <w:tcPr>
-            <w:tcW w:type="dxa" w:w="3213"/>
+            <w:tcW w:type="dxa" w:w="5669"/>
+            <w:vAlign w:val="center"/>
+            <w:shd w:fill="F3F6F8"/>
+            <w:tcMar>
+              <w:top w:w="100" w:type="dxa"/>
+              <w:bottom w:w="100" w:type="dxa"/>
+              <w:left w:w="120" w:type="dxa"/>
+              <w:right w:w="120" w:type="dxa"/>
+            </w:tcMar>
           </w:tcPr>
           <w:p>
             <w:pPr>
@@ -1012,6 +1547,7 @@
             </w:pPr>
             <w:r>
               <w:rPr>
+                <w:color w:val="000000"/>
                 <w:sz w:val="18"/>
               </w:rPr>
               <w:t>10种合成扰动，原图8/10→增强10/10</w:t>
@@ -1070,12 +1606,21 @@
       <w:tblPr>
         <w:tblStyle w:val="LightShading-Accent1"/>
         <w:tblW w:type="auto" w:w="0"/>
+        <w:tblLayout w:type="fixed"/>
         <w:tblLook w:firstColumn="1" w:firstRow="1" w:lastColumn="0" w:lastRow="0" w:noHBand="0" w:noVBand="1" w:val="04A0"/>
+        <w:tblBorders>
+          <w:top w:val="single" w:sz="4" w:color="D9D9D9"/>
+          <w:left w:val="single" w:sz="4" w:color="D9D9D9"/>
+          <w:bottom w:val="single" w:sz="4" w:color="D9D9D9"/>
+          <w:right w:val="single" w:sz="4" w:color="D9D9D9"/>
+          <w:insideH w:val="single" w:sz="4" w:color="D9D9D9"/>
+          <w:insideV w:val="single" w:sz="4" w:color="D9D9D9"/>
+        </w:tblBorders>
       </w:tblPr>
       <w:tblGrid>
-        <w:gridCol w:w="3213"/>
-        <w:gridCol w:w="3213"/>
-        <w:gridCol w:w="3213"/>
+        <w:gridCol w:w="2154"/>
+        <w:gridCol w:w="3118"/>
+        <w:gridCol w:w="4365"/>
       </w:tblGrid>
       <w:tr>
         <w:trPr>
@@ -1084,14 +1629,24 @@
         </w:trPr>
         <w:tc>
           <w:tcPr>
-            <w:tcW w:type="dxa" w:w="3213"/>
+            <w:tcW w:type="dxa" w:w="2154"/>
+            <w:vAlign w:val="center"/>
+            <w:shd w:fill="172A3A"/>
+            <w:tcMar>
+              <w:top w:w="100" w:type="dxa"/>
+              <w:bottom w:w="100" w:type="dxa"/>
+              <w:left w:w="120" w:type="dxa"/>
+              <w:right w:w="120" w:type="dxa"/>
+            </w:tcMar>
           </w:tcPr>
           <w:p>
             <w:pPr>
+              <w:keepNext/>
               <w:spacing w:after="100" w:line="264" w:lineRule="auto"/>
             </w:pPr>
             <w:r>
               <w:rPr>
+                <w:color w:val="FFFFFF"/>
                 <w:sz w:val="18"/>
               </w:rPr>
               <w:t>对象</w:t>
@@ -1100,14 +1655,24 @@
         </w:tc>
         <w:tc>
           <w:tcPr>
-            <w:tcW w:type="dxa" w:w="3213"/>
+            <w:tcW w:type="dxa" w:w="3118"/>
+            <w:vAlign w:val="center"/>
+            <w:shd w:fill="172A3A"/>
+            <w:tcMar>
+              <w:top w:w="100" w:type="dxa"/>
+              <w:bottom w:w="100" w:type="dxa"/>
+              <w:left w:w="120" w:type="dxa"/>
+              <w:right w:w="120" w:type="dxa"/>
+            </w:tcMar>
           </w:tcPr>
           <w:p>
             <w:pPr>
+              <w:keepNext/>
               <w:spacing w:after="100" w:line="264" w:lineRule="auto"/>
             </w:pPr>
             <w:r>
               <w:rPr>
+                <w:color w:val="FFFFFF"/>
                 <w:sz w:val="18"/>
               </w:rPr>
               <w:t>当前支持</w:t>
@@ -1116,14 +1681,24 @@
         </w:tc>
         <w:tc>
           <w:tcPr>
-            <w:tcW w:type="dxa" w:w="3213"/>
+            <w:tcW w:type="dxa" w:w="4365"/>
+            <w:vAlign w:val="center"/>
+            <w:shd w:fill="172A3A"/>
+            <w:tcMar>
+              <w:top w:w="100" w:type="dxa"/>
+              <w:bottom w:w="100" w:type="dxa"/>
+              <w:left w:w="120" w:type="dxa"/>
+              <w:right w:w="120" w:type="dxa"/>
+            </w:tcMar>
           </w:tcPr>
           <w:p>
             <w:pPr>
+              <w:keepNext/>
               <w:spacing w:after="100" w:line="264" w:lineRule="auto"/>
             </w:pPr>
             <w:r>
               <w:rPr>
+                <w:color w:val="FFFFFF"/>
                 <w:sz w:val="18"/>
               </w:rPr>
               <w:t>边界</w:t>
@@ -1137,7 +1712,15 @@
         </w:trPr>
         <w:tc>
           <w:tcPr>
-            <w:tcW w:type="dxa" w:w="3213"/>
+            <w:tcW w:type="dxa" w:w="2154"/>
+            <w:vAlign w:val="center"/>
+            <w:shd w:fill="F3F6F8"/>
+            <w:tcMar>
+              <w:top w:w="100" w:type="dxa"/>
+              <w:bottom w:w="100" w:type="dxa"/>
+              <w:left w:w="120" w:type="dxa"/>
+              <w:right w:w="120" w:type="dxa"/>
+            </w:tcMar>
           </w:tcPr>
           <w:p>
             <w:pPr>
@@ -1145,6 +1728,7 @@
             </w:pPr>
             <w:r>
               <w:rPr>
+                <w:color w:val="000000"/>
                 <w:sz w:val="18"/>
               </w:rPr>
               <w:t>数据库</w:t>
@@ -1153,7 +1737,15 @@
         </w:tc>
         <w:tc>
           <w:tcPr>
-            <w:tcW w:type="dxa" w:w="3213"/>
+            <w:tcW w:type="dxa" w:w="3118"/>
+            <w:vAlign w:val="center"/>
+            <w:shd w:fill="F3F6F8"/>
+            <w:tcMar>
+              <w:top w:w="100" w:type="dxa"/>
+              <w:bottom w:w="100" w:type="dxa"/>
+              <w:left w:w="120" w:type="dxa"/>
+              <w:right w:w="120" w:type="dxa"/>
+            </w:tcMar>
           </w:tcPr>
           <w:p>
             <w:pPr>
@@ -1161,6 +1753,7 @@
             </w:pPr>
             <w:r>
               <w:rPr>
+                <w:color w:val="000000"/>
                 <w:sz w:val="18"/>
               </w:rPr>
               <w:t>SQLite演示库与公开Chinook</w:t>
@@ -1169,7 +1762,15 @@
         </w:tc>
         <w:tc>
           <w:tcPr>
-            <w:tcW w:type="dxa" w:w="3213"/>
+            <w:tcW w:type="dxa" w:w="4365"/>
+            <w:vAlign w:val="center"/>
+            <w:shd w:fill="F3F6F8"/>
+            <w:tcMar>
+              <w:top w:w="100" w:type="dxa"/>
+              <w:bottom w:w="100" w:type="dxa"/>
+              <w:left w:w="120" w:type="dxa"/>
+              <w:right w:w="120" w:type="dxa"/>
+            </w:tcMar>
           </w:tcPr>
           <w:p>
             <w:pPr>
@@ -1177,6 +1778,7 @@
             </w:pPr>
             <w:r>
               <w:rPr>
+                <w:color w:val="000000"/>
                 <w:sz w:val="18"/>
               </w:rPr>
               <w:t>其他数据库方言未作运行验收</w:t>
@@ -1190,7 +1792,15 @@
         </w:trPr>
         <w:tc>
           <w:tcPr>
-            <w:tcW w:type="dxa" w:w="3213"/>
+            <w:tcW w:type="dxa" w:w="2154"/>
+            <w:vAlign w:val="center"/>
+            <w:shd w:fill="FFFFFF"/>
+            <w:tcMar>
+              <w:top w:w="100" w:type="dxa"/>
+              <w:bottom w:w="100" w:type="dxa"/>
+              <w:left w:w="120" w:type="dxa"/>
+              <w:right w:w="120" w:type="dxa"/>
+            </w:tcMar>
           </w:tcPr>
           <w:p>
             <w:pPr>
@@ -1198,6 +1808,7 @@
             </w:pPr>
             <w:r>
               <w:rPr>
+                <w:color w:val="000000"/>
                 <w:sz w:val="18"/>
               </w:rPr>
               <w:t>文档</w:t>
@@ -1206,7 +1817,15 @@
         </w:tc>
         <w:tc>
           <w:tcPr>
-            <w:tcW w:type="dxa" w:w="3213"/>
+            <w:tcW w:type="dxa" w:w="3118"/>
+            <w:vAlign w:val="center"/>
+            <w:shd w:fill="FFFFFF"/>
+            <w:tcMar>
+              <w:top w:w="100" w:type="dxa"/>
+              <w:bottom w:w="100" w:type="dxa"/>
+              <w:left w:w="120" w:type="dxa"/>
+              <w:right w:w="120" w:type="dxa"/>
+            </w:tcMar>
           </w:tcPr>
           <w:p>
             <w:pPr>
@@ -1214,6 +1833,7 @@
             </w:pPr>
             <w:r>
               <w:rPr>
+                <w:color w:val="000000"/>
                 <w:sz w:val="18"/>
               </w:rPr>
               <w:t>15份实际文件、6种格式</w:t>
@@ -1222,7 +1842,15 @@
         </w:tc>
         <w:tc>
           <w:tcPr>
-            <w:tcW w:type="dxa" w:w="3213"/>
+            <w:tcW w:type="dxa" w:w="4365"/>
+            <w:vAlign w:val="center"/>
+            <w:shd w:fill="FFFFFF"/>
+            <w:tcMar>
+              <w:top w:w="100" w:type="dxa"/>
+              <w:bottom w:w="100" w:type="dxa"/>
+              <w:left w:w="120" w:type="dxa"/>
+              <w:right w:w="120" w:type="dxa"/>
+            </w:tcMar>
           </w:tcPr>
           <w:p>
             <w:pPr>
@@ -1230,6 +1858,7 @@
             </w:pPr>
             <w:r>
               <w:rPr>
+                <w:color w:val="000000"/>
                 <w:sz w:val="18"/>
               </w:rPr>
               <w:t>合成样本，非真实客户资料</w:t>
@@ -1243,7 +1872,15 @@
         </w:trPr>
         <w:tc>
           <w:tcPr>
-            <w:tcW w:type="dxa" w:w="3213"/>
+            <w:tcW w:type="dxa" w:w="2154"/>
+            <w:vAlign w:val="center"/>
+            <w:shd w:fill="F3F6F8"/>
+            <w:tcMar>
+              <w:top w:w="100" w:type="dxa"/>
+              <w:bottom w:w="100" w:type="dxa"/>
+              <w:left w:w="120" w:type="dxa"/>
+              <w:right w:w="120" w:type="dxa"/>
+            </w:tcMar>
           </w:tcPr>
           <w:p>
             <w:pPr>
@@ -1251,6 +1888,7 @@
             </w:pPr>
             <w:r>
               <w:rPr>
+                <w:color w:val="000000"/>
                 <w:sz w:val="18"/>
               </w:rPr>
               <w:t>模型</w:t>
@@ -1259,7 +1897,15 @@
         </w:tc>
         <w:tc>
           <w:tcPr>
-            <w:tcW w:type="dxa" w:w="3213"/>
+            <w:tcW w:type="dxa" w:w="3118"/>
+            <w:vAlign w:val="center"/>
+            <w:shd w:fill="F3F6F8"/>
+            <w:tcMar>
+              <w:top w:w="100" w:type="dxa"/>
+              <w:bottom w:w="100" w:type="dxa"/>
+              <w:left w:w="120" w:type="dxa"/>
+              <w:right w:w="120" w:type="dxa"/>
+            </w:tcMar>
           </w:tcPr>
           <w:p>
             <w:pPr>
@@ -1267,6 +1913,7 @@
             </w:pPr>
             <w:r>
               <w:rPr>
+                <w:color w:val="000000"/>
                 <w:sz w:val="18"/>
               </w:rPr>
               <w:t>指定Responses兼容接口</w:t>
@@ -1275,7 +1922,15 @@
         </w:tc>
         <w:tc>
           <w:tcPr>
-            <w:tcW w:type="dxa" w:w="3213"/>
+            <w:tcW w:type="dxa" w:w="4365"/>
+            <w:vAlign w:val="center"/>
+            <w:shd w:fill="F3F6F8"/>
+            <w:tcMar>
+              <w:top w:w="100" w:type="dxa"/>
+              <w:bottom w:w="100" w:type="dxa"/>
+              <w:left w:w="120" w:type="dxa"/>
+              <w:right w:w="120" w:type="dxa"/>
+            </w:tcMar>
           </w:tcPr>
           <w:p>
             <w:pPr>
@@ -1283,6 +1938,7 @@
             </w:pPr>
             <w:r>
               <w:rPr>
+                <w:color w:val="000000"/>
                 <w:sz w:val="18"/>
               </w:rPr>
               <w:t>仅gpt-6-luna，鉴权尚未通过</w:t>
@@ -1296,7 +1952,15 @@
         </w:trPr>
         <w:tc>
           <w:tcPr>
-            <w:tcW w:type="dxa" w:w="3213"/>
+            <w:tcW w:type="dxa" w:w="2154"/>
+            <w:vAlign w:val="center"/>
+            <w:shd w:fill="FFFFFF"/>
+            <w:tcMar>
+              <w:top w:w="100" w:type="dxa"/>
+              <w:bottom w:w="100" w:type="dxa"/>
+              <w:left w:w="120" w:type="dxa"/>
+              <w:right w:w="120" w:type="dxa"/>
+            </w:tcMar>
           </w:tcPr>
           <w:p>
             <w:pPr>
@@ -1304,6 +1968,7 @@
             </w:pPr>
             <w:r>
               <w:rPr>
+                <w:color w:val="000000"/>
                 <w:sz w:val="18"/>
               </w:rPr>
               <w:t>交互</w:t>
@@ -1312,7 +1977,15 @@
         </w:tc>
         <w:tc>
           <w:tcPr>
-            <w:tcW w:type="dxa" w:w="3213"/>
+            <w:tcW w:type="dxa" w:w="3118"/>
+            <w:vAlign w:val="center"/>
+            <w:shd w:fill="FFFFFF"/>
+            <w:tcMar>
+              <w:top w:w="100" w:type="dxa"/>
+              <w:bottom w:w="100" w:type="dxa"/>
+              <w:left w:w="120" w:type="dxa"/>
+              <w:right w:w="120" w:type="dxa"/>
+            </w:tcMar>
           </w:tcPr>
           <w:p>
             <w:pPr>
@@ -1320,6 +1993,7 @@
             </w:pPr>
             <w:r>
               <w:rPr>
+                <w:color w:val="000000"/>
                 <w:sz w:val="18"/>
               </w:rPr>
               <w:t>问数/知识库/验收工作台</w:t>
@@ -1328,7 +2002,15 @@
         </w:tc>
         <w:tc>
           <w:tcPr>
-            <w:tcW w:type="dxa" w:w="3213"/>
+            <w:tcW w:type="dxa" w:w="4365"/>
+            <w:vAlign w:val="center"/>
+            <w:shd w:fill="FFFFFF"/>
+            <w:tcMar>
+              <w:top w:w="100" w:type="dxa"/>
+              <w:bottom w:w="100" w:type="dxa"/>
+              <w:left w:w="120" w:type="dxa"/>
+              <w:right w:w="120" w:type="dxa"/>
+            </w:tcMar>
           </w:tcPr>
           <w:p>
             <w:pPr>
@@ -1336,6 +2018,7 @@
             </w:pPr>
             <w:r>
               <w:rPr>
+                <w:color w:val="000000"/>
                 <w:sz w:val="18"/>
               </w:rPr>
               <w:t>本地开发服务，不声称完成生产审计</w:t>
@@ -1358,7 +2041,7 @@
         <w:spacing w:after="160" w:line="300" w:lineRule="auto"/>
       </w:pPr>
       <w:r>
-        <w:t>问数设计：意图与可执行口径</w:t>
+        <w:t>问数设计 意图与可执行口径</w:t>
       </w:r>
     </w:p>
     <w:p>
@@ -1440,7 +2123,7 @@
         <w:spacing w:after="160" w:line="300" w:lineRule="auto"/>
       </w:pPr>
       <w:r>
-        <w:t>跨源设计：每一步都有来源</w:t>
+        <w:t>跨源设计 每一步都有来源</w:t>
       </w:r>
     </w:p>
     <w:p>
@@ -1455,12 +2138,21 @@
       <w:tblPr>
         <w:tblStyle w:val="LightShading-Accent1"/>
         <w:tblW w:type="auto" w:w="0"/>
+        <w:tblLayout w:type="fixed"/>
         <w:tblLook w:firstColumn="1" w:firstRow="1" w:lastColumn="0" w:lastRow="0" w:noHBand="0" w:noVBand="1" w:val="04A0"/>
+        <w:tblBorders>
+          <w:top w:val="single" w:sz="4" w:color="D9D9D9"/>
+          <w:left w:val="single" w:sz="4" w:color="D9D9D9"/>
+          <w:bottom w:val="single" w:sz="4" w:color="D9D9D9"/>
+          <w:right w:val="single" w:sz="4" w:color="D9D9D9"/>
+          <w:insideH w:val="single" w:sz="4" w:color="D9D9D9"/>
+          <w:insideV w:val="single" w:sz="4" w:color="D9D9D9"/>
+        </w:tblBorders>
       </w:tblPr>
       <w:tblGrid>
-        <w:gridCol w:w="3213"/>
-        <w:gridCol w:w="3213"/>
-        <w:gridCol w:w="3213"/>
+        <w:gridCol w:w="2154"/>
+        <w:gridCol w:w="3118"/>
+        <w:gridCol w:w="4365"/>
       </w:tblGrid>
       <w:tr>
         <w:trPr>
@@ -1469,14 +2161,24 @@
         </w:trPr>
         <w:tc>
           <w:tcPr>
-            <w:tcW w:type="dxa" w:w="3213"/>
+            <w:tcW w:type="dxa" w:w="2154"/>
+            <w:vAlign w:val="center"/>
+            <w:shd w:fill="172A3A"/>
+            <w:tcMar>
+              <w:top w:w="100" w:type="dxa"/>
+              <w:bottom w:w="100" w:type="dxa"/>
+              <w:left w:w="120" w:type="dxa"/>
+              <w:right w:w="120" w:type="dxa"/>
+            </w:tcMar>
           </w:tcPr>
           <w:p>
             <w:pPr>
+              <w:keepNext/>
               <w:spacing w:after="100" w:line="264" w:lineRule="auto"/>
             </w:pPr>
             <w:r>
               <w:rPr>
+                <w:color w:val="FFFFFF"/>
                 <w:sz w:val="18"/>
               </w:rPr>
               <w:t>场景</w:t>
@@ -1485,14 +2187,24 @@
         </w:tc>
         <w:tc>
           <w:tcPr>
-            <w:tcW w:type="dxa" w:w="3213"/>
+            <w:tcW w:type="dxa" w:w="3118"/>
+            <w:vAlign w:val="center"/>
+            <w:shd w:fill="172A3A"/>
+            <w:tcMar>
+              <w:top w:w="100" w:type="dxa"/>
+              <w:bottom w:w="100" w:type="dxa"/>
+              <w:left w:w="120" w:type="dxa"/>
+              <w:right w:w="120" w:type="dxa"/>
+            </w:tcMar>
           </w:tcPr>
           <w:p>
             <w:pPr>
+              <w:keepNext/>
               <w:spacing w:after="100" w:line="264" w:lineRule="auto"/>
             </w:pPr>
             <w:r>
               <w:rPr>
+                <w:color w:val="FFFFFF"/>
                 <w:sz w:val="18"/>
               </w:rPr>
               <w:t>依赖链</w:t>
@@ -1501,14 +2213,24 @@
         </w:tc>
         <w:tc>
           <w:tcPr>
-            <w:tcW w:type="dxa" w:w="3213"/>
+            <w:tcW w:type="dxa" w:w="4365"/>
+            <w:vAlign w:val="center"/>
+            <w:shd w:fill="172A3A"/>
+            <w:tcMar>
+              <w:top w:w="100" w:type="dxa"/>
+              <w:bottom w:w="100" w:type="dxa"/>
+              <w:left w:w="120" w:type="dxa"/>
+              <w:right w:w="120" w:type="dxa"/>
+            </w:tcMar>
           </w:tcPr>
           <w:p>
             <w:pPr>
+              <w:keepNext/>
               <w:spacing w:after="100" w:line="264" w:lineRule="auto"/>
             </w:pPr>
             <w:r>
               <w:rPr>
+                <w:color w:val="FFFFFF"/>
                 <w:sz w:val="18"/>
               </w:rPr>
               <w:t>核验</w:t>
@@ -1522,7 +2244,15 @@
         </w:trPr>
         <w:tc>
           <w:tcPr>
-            <w:tcW w:type="dxa" w:w="3213"/>
+            <w:tcW w:type="dxa" w:w="2154"/>
+            <w:vAlign w:val="center"/>
+            <w:shd w:fill="F3F6F8"/>
+            <w:tcMar>
+              <w:top w:w="100" w:type="dxa"/>
+              <w:bottom w:w="100" w:type="dxa"/>
+              <w:left w:w="120" w:type="dxa"/>
+              <w:right w:w="120" w:type="dxa"/>
+            </w:tcMar>
           </w:tcPr>
           <w:p>
             <w:pPr>
@@ -1530,15 +2260,24 @@
             </w:pPr>
             <w:r>
               <w:rPr>
+                <w:color w:val="000000"/>
                 <w:sz w:val="18"/>
               </w:rPr>
-              <w:t>预测</w:t>
+              <w:t>客单价</w:t>
             </w:r>
           </w:p>
         </w:tc>
         <w:tc>
           <w:tcPr>
-            <w:tcW w:type="dxa" w:w="3213"/>
+            <w:tcW w:type="dxa" w:w="3118"/>
+            <w:vAlign w:val="center"/>
+            <w:shd w:fill="F3F6F8"/>
+            <w:tcMar>
+              <w:top w:w="100" w:type="dxa"/>
+              <w:bottom w:w="100" w:type="dxa"/>
+              <w:left w:w="120" w:type="dxa"/>
+              <w:right w:w="120" w:type="dxa"/>
+            </w:tcMar>
           </w:tcPr>
           <w:p>
             <w:pPr>
@@ -1546,15 +2285,24 @@
             </w:pPr>
             <w:r>
               <w:rPr>
+                <w:color w:val="000000"/>
                 <w:sz w:val="18"/>
               </w:rPr>
-              <w:t>文档公式→全年SQL基准→Excel增长率→计算</w:t>
+              <w:t>文档公式→SQL销售额/订单数→计算</w:t>
             </w:r>
           </w:p>
         </w:tc>
         <w:tc>
           <w:tcPr>
-            <w:tcW w:type="dxa" w:w="3213"/>
+            <w:tcW w:type="dxa" w:w="4365"/>
+            <w:vAlign w:val="center"/>
+            <w:shd w:fill="F3F6F8"/>
+            <w:tcMar>
+              <w:top w:w="100" w:type="dxa"/>
+              <w:bottom w:w="100" w:type="dxa"/>
+              <w:left w:w="120" w:type="dxa"/>
+              <w:right w:w="120" w:type="dxa"/>
+            </w:tcMar>
           </w:tcPr>
           <w:p>
             <w:pPr>
@@ -1562,9 +2310,10 @@
             </w:pPr>
             <w:r>
               <w:rPr>
+                <w:color w:val="000000"/>
                 <w:sz w:val="18"/>
               </w:rPr>
-              <w:t>基准年、目标年、参数适用年</w:t>
+              <w:t>来源与零分母</w:t>
             </w:r>
           </w:p>
         </w:tc>
@@ -1575,7 +2324,15 @@
         </w:trPr>
         <w:tc>
           <w:tcPr>
-            <w:tcW w:type="dxa" w:w="3213"/>
+            <w:tcW w:type="dxa" w:w="2154"/>
+            <w:vAlign w:val="center"/>
+            <w:shd w:fill="FFFFFF"/>
+            <w:tcMar>
+              <w:top w:w="100" w:type="dxa"/>
+              <w:bottom w:w="100" w:type="dxa"/>
+              <w:left w:w="120" w:type="dxa"/>
+              <w:right w:w="120" w:type="dxa"/>
+            </w:tcMar>
           </w:tcPr>
           <w:p>
             <w:pPr>
@@ -1583,15 +2340,24 @@
             </w:pPr>
             <w:r>
               <w:rPr>
+                <w:color w:val="000000"/>
                 <w:sz w:val="18"/>
               </w:rPr>
-              <w:t>回款</w:t>
+              <w:t>预测</w:t>
             </w:r>
           </w:p>
         </w:tc>
         <w:tc>
           <w:tcPr>
-            <w:tcW w:type="dxa" w:w="3213"/>
+            <w:tcW w:type="dxa" w:w="3118"/>
+            <w:vAlign w:val="center"/>
+            <w:shd w:fill="FFFFFF"/>
+            <w:tcMar>
+              <w:top w:w="100" w:type="dxa"/>
+              <w:bottom w:w="100" w:type="dxa"/>
+              <w:left w:w="120" w:type="dxa"/>
+              <w:right w:w="120" w:type="dxa"/>
+            </w:tcMar>
           </w:tcPr>
           <w:p>
             <w:pPr>
@@ -1599,15 +2365,24 @@
             </w:pPr>
             <w:r>
               <w:rPr>
+                <w:color w:val="000000"/>
                 <w:sz w:val="18"/>
               </w:rPr>
-              <w:t>SQL金额→Excel费率→计算</w:t>
+              <w:t>PDF公式→SQL基准→Excel增长率</w:t>
             </w:r>
           </w:p>
         </w:tc>
         <w:tc>
           <w:tcPr>
-            <w:tcW w:type="dxa" w:w="3213"/>
+            <w:tcW w:type="dxa" w:w="4365"/>
+            <w:vAlign w:val="center"/>
+            <w:shd w:fill="FFFFFF"/>
+            <w:tcMar>
+              <w:top w:w="100" w:type="dxa"/>
+              <w:bottom w:w="100" w:type="dxa"/>
+              <w:left w:w="120" w:type="dxa"/>
+              <w:right w:w="120" w:type="dxa"/>
+            </w:tcMar>
           </w:tcPr>
           <w:p>
             <w:pPr>
@@ -1615,9 +2390,10 @@
             </w:pPr>
             <w:r>
               <w:rPr>
+                <w:color w:val="000000"/>
                 <w:sz w:val="18"/>
               </w:rPr>
-              <w:t>金额单位与百分数尺度</w:t>
+              <w:t>年份与单位</w:t>
             </w:r>
           </w:p>
         </w:tc>
@@ -1628,7 +2404,15 @@
         </w:trPr>
         <w:tc>
           <w:tcPr>
-            <w:tcW w:type="dxa" w:w="3213"/>
+            <w:tcW w:type="dxa" w:w="2154"/>
+            <w:vAlign w:val="center"/>
+            <w:shd w:fill="F3F6F8"/>
+            <w:tcMar>
+              <w:top w:w="100" w:type="dxa"/>
+              <w:bottom w:w="100" w:type="dxa"/>
+              <w:left w:w="120" w:type="dxa"/>
+              <w:right w:w="120" w:type="dxa"/>
+            </w:tcMar>
           </w:tcPr>
           <w:p>
             <w:pPr>
@@ -1636,15 +2420,24 @@
             </w:pPr>
             <w:r>
               <w:rPr>
+                <w:color w:val="000000"/>
                 <w:sz w:val="18"/>
               </w:rPr>
-              <w:t>门槛判定</w:t>
+              <w:t>地区问数</w:t>
             </w:r>
           </w:p>
         </w:tc>
         <w:tc>
           <w:tcPr>
-            <w:tcW w:type="dxa" w:w="3213"/>
+            <w:tcW w:type="dxa" w:w="3118"/>
+            <w:vAlign w:val="center"/>
+            <w:shd w:fill="F3F6F8"/>
+            <w:tcMar>
+              <w:top w:w="100" w:type="dxa"/>
+              <w:bottom w:w="100" w:type="dxa"/>
+              <w:left w:w="120" w:type="dxa"/>
+              <w:right w:w="120" w:type="dxa"/>
+            </w:tcMar>
           </w:tcPr>
           <w:p>
             <w:pPr>
@@ -1652,15 +2445,24 @@
             </w:pPr>
             <w:r>
               <w:rPr>
+                <w:color w:val="000000"/>
                 <w:sz w:val="18"/>
               </w:rPr>
-              <w:t>SQL指标→文档阈值→比较</w:t>
+              <w:t>Excel地区→SQL过滤</w:t>
             </w:r>
           </w:p>
         </w:tc>
         <w:tc>
           <w:tcPr>
-            <w:tcW w:type="dxa" w:w="3213"/>
+            <w:tcW w:type="dxa" w:w="4365"/>
+            <w:vAlign w:val="center"/>
+            <w:shd w:fill="F3F6F8"/>
+            <w:tcMar>
+              <w:top w:w="100" w:type="dxa"/>
+              <w:bottom w:w="100" w:type="dxa"/>
+              <w:left w:w="120" w:type="dxa"/>
+              <w:right w:w="120" w:type="dxa"/>
+            </w:tcMar>
           </w:tcPr>
           <w:p>
             <w:pPr>
@@ -1668,9 +2470,10 @@
             </w:pPr>
             <w:r>
               <w:rPr>
+                <w:color w:val="000000"/>
                 <w:sz w:val="18"/>
               </w:rPr>
-              <w:t>阈值原文、单位及时间</w:t>
+              <w:t>实际单元格与地区</w:t>
             </w:r>
           </w:p>
         </w:tc>
@@ -1681,7 +2484,15 @@
         </w:trPr>
         <w:tc>
           <w:tcPr>
-            <w:tcW w:type="dxa" w:w="3213"/>
+            <w:tcW w:type="dxa" w:w="2154"/>
+            <w:vAlign w:val="center"/>
+            <w:shd w:fill="FFFFFF"/>
+            <w:tcMar>
+              <w:top w:w="100" w:type="dxa"/>
+              <w:bottom w:w="100" w:type="dxa"/>
+              <w:left w:w="120" w:type="dxa"/>
+              <w:right w:w="120" w:type="dxa"/>
+            </w:tcMar>
           </w:tcPr>
           <w:p>
             <w:pPr>
@@ -1689,15 +2500,24 @@
             </w:pPr>
             <w:r>
               <w:rPr>
+                <w:color w:val="000000"/>
                 <w:sz w:val="18"/>
               </w:rPr>
-              <w:t>政策问答</w:t>
+              <w:t>冠军经验</w:t>
             </w:r>
           </w:p>
         </w:tc>
         <w:tc>
           <w:tcPr>
-            <w:tcW w:type="dxa" w:w="3213"/>
+            <w:tcW w:type="dxa" w:w="3118"/>
+            <w:vAlign w:val="center"/>
+            <w:shd w:fill="FFFFFF"/>
+            <w:tcMar>
+              <w:top w:w="100" w:type="dxa"/>
+              <w:bottom w:w="100" w:type="dxa"/>
+              <w:left w:w="120" w:type="dxa"/>
+              <w:right w:w="120" w:type="dxa"/>
+            </w:tcMar>
           </w:tcPr>
           <w:p>
             <w:pPr>
@@ -1705,15 +2525,24 @@
             </w:pPr>
             <w:r>
               <w:rPr>
+                <w:color w:val="000000"/>
                 <w:sz w:val="18"/>
               </w:rPr>
-              <w:t>多版本文档→日期选择→事实</w:t>
+              <w:t>SQL排名→冠军实体→文档检索</w:t>
             </w:r>
           </w:p>
         </w:tc>
         <w:tc>
           <w:tcPr>
-            <w:tcW w:type="dxa" w:w="3213"/>
+            <w:tcW w:type="dxa" w:w="4365"/>
+            <w:vAlign w:val="center"/>
+            <w:shd w:fill="FFFFFF"/>
+            <w:tcMar>
+              <w:top w:w="100" w:type="dxa"/>
+              <w:bottom w:w="100" w:type="dxa"/>
+              <w:left w:w="120" w:type="dxa"/>
+              <w:right w:w="120" w:type="dxa"/>
+            </w:tcMar>
           </w:tcPr>
           <w:p>
             <w:pPr>
@@ -1721,9 +2550,10 @@
             </w:pPr>
             <w:r>
               <w:rPr>
+                <w:color w:val="000000"/>
                 <w:sz w:val="18"/>
               </w:rPr>
-              <w:t>生效时间、重叠与缺失</w:t>
+              <w:t>实体与引用</w:t>
             </w:r>
           </w:p>
         </w:tc>
@@ -1734,7 +2564,15 @@
         </w:trPr>
         <w:tc>
           <w:tcPr>
-            <w:tcW w:type="dxa" w:w="3213"/>
+            <w:tcW w:type="dxa" w:w="2154"/>
+            <w:vAlign w:val="center"/>
+            <w:shd w:fill="F3F6F8"/>
+            <w:tcMar>
+              <w:top w:w="100" w:type="dxa"/>
+              <w:bottom w:w="100" w:type="dxa"/>
+              <w:left w:w="120" w:type="dxa"/>
+              <w:right w:w="120" w:type="dxa"/>
+            </w:tcMar>
           </w:tcPr>
           <w:p>
             <w:pPr>
@@ -1742,15 +2580,24 @@
             </w:pPr>
             <w:r>
               <w:rPr>
+                <w:color w:val="000000"/>
                 <w:sz w:val="18"/>
               </w:rPr>
-              <w:t>客户口径</w:t>
+              <w:t>阈值比较</w:t>
             </w:r>
           </w:p>
         </w:tc>
         <w:tc>
           <w:tcPr>
-            <w:tcW w:type="dxa" w:w="3213"/>
+            <w:tcW w:type="dxa" w:w="3118"/>
+            <w:vAlign w:val="center"/>
+            <w:shd w:fill="F3F6F8"/>
+            <w:tcMar>
+              <w:top w:w="100" w:type="dxa"/>
+              <w:bottom w:w="100" w:type="dxa"/>
+              <w:left w:w="120" w:type="dxa"/>
+              <w:right w:w="120" w:type="dxa"/>
+            </w:tcMar>
           </w:tcPr>
           <w:p>
             <w:pPr>
@@ -1758,15 +2605,24 @@
             </w:pPr>
             <w:r>
               <w:rPr>
+                <w:color w:val="000000"/>
                 <w:sz w:val="18"/>
               </w:rPr>
-              <w:t>SQL实体→文档说明→汇总</w:t>
+              <w:t>文档检索→Excel阈值→比较</w:t>
             </w:r>
           </w:p>
         </w:tc>
         <w:tc>
           <w:tcPr>
-            <w:tcW w:type="dxa" w:w="3213"/>
+            <w:tcW w:type="dxa" w:w="4365"/>
+            <w:vAlign w:val="center"/>
+            <w:shd w:fill="F3F6F8"/>
+            <w:tcMar>
+              <w:top w:w="100" w:type="dxa"/>
+              <w:bottom w:w="100" w:type="dxa"/>
+              <w:left w:w="120" w:type="dxa"/>
+              <w:right w:w="120" w:type="dxa"/>
+            </w:tcMar>
           </w:tcPr>
           <w:p>
             <w:pPr>
@@ -1774,9 +2630,10 @@
             </w:pPr>
             <w:r>
               <w:rPr>
+                <w:color w:val="000000"/>
                 <w:sz w:val="18"/>
               </w:rPr>
-              <w:t>实体范围及引用</w:t>
+              <w:t>来源与数值</w:t>
             </w:r>
           </w:p>
         </w:tc>
@@ -1803,12 +2660,21 @@
       <w:tblPr>
         <w:tblStyle w:val="LightShading-Accent1"/>
         <w:tblW w:type="auto" w:w="0"/>
+        <w:tblLayout w:type="fixed"/>
         <w:tblLook w:firstColumn="1" w:firstRow="1" w:lastColumn="0" w:lastRow="0" w:noHBand="0" w:noVBand="1" w:val="04A0"/>
+        <w:tblBorders>
+          <w:top w:val="single" w:sz="4" w:color="D9D9D9"/>
+          <w:left w:val="single" w:sz="4" w:color="D9D9D9"/>
+          <w:bottom w:val="single" w:sz="4" w:color="D9D9D9"/>
+          <w:right w:val="single" w:sz="4" w:color="D9D9D9"/>
+          <w:insideH w:val="single" w:sz="4" w:color="D9D9D9"/>
+          <w:insideV w:val="single" w:sz="4" w:color="D9D9D9"/>
+        </w:tblBorders>
       </w:tblPr>
       <w:tblGrid>
-        <w:gridCol w:w="3213"/>
-        <w:gridCol w:w="3213"/>
-        <w:gridCol w:w="3213"/>
+        <w:gridCol w:w="2154"/>
+        <w:gridCol w:w="3118"/>
+        <w:gridCol w:w="4365"/>
       </w:tblGrid>
       <w:tr>
         <w:trPr>
@@ -1817,14 +2683,24 @@
         </w:trPr>
         <w:tc>
           <w:tcPr>
-            <w:tcW w:type="dxa" w:w="3213"/>
+            <w:tcW w:type="dxa" w:w="2154"/>
+            <w:vAlign w:val="center"/>
+            <w:shd w:fill="172A3A"/>
+            <w:tcMar>
+              <w:top w:w="100" w:type="dxa"/>
+              <w:bottom w:w="100" w:type="dxa"/>
+              <w:left w:w="120" w:type="dxa"/>
+              <w:right w:w="120" w:type="dxa"/>
+            </w:tcMar>
           </w:tcPr>
           <w:p>
             <w:pPr>
+              <w:keepNext/>
               <w:spacing w:after="100" w:line="264" w:lineRule="auto"/>
             </w:pPr>
             <w:r>
               <w:rPr>
+                <w:color w:val="FFFFFF"/>
                 <w:sz w:val="18"/>
               </w:rPr>
               <w:t>评测</w:t>
@@ -1833,14 +2709,24 @@
         </w:tc>
         <w:tc>
           <w:tcPr>
-            <w:tcW w:type="dxa" w:w="3213"/>
+            <w:tcW w:type="dxa" w:w="3118"/>
+            <w:vAlign w:val="center"/>
+            <w:shd w:fill="172A3A"/>
+            <w:tcMar>
+              <w:top w:w="100" w:type="dxa"/>
+              <w:bottom w:w="100" w:type="dxa"/>
+              <w:left w:w="120" w:type="dxa"/>
+              <w:right w:w="120" w:type="dxa"/>
+            </w:tcMar>
           </w:tcPr>
           <w:p>
             <w:pPr>
+              <w:keepNext/>
               <w:spacing w:after="100" w:line="264" w:lineRule="auto"/>
             </w:pPr>
             <w:r>
               <w:rPr>
+                <w:color w:val="FFFFFF"/>
                 <w:sz w:val="18"/>
               </w:rPr>
               <w:t>结果</w:t>
@@ -1849,14 +2735,24 @@
         </w:tc>
         <w:tc>
           <w:tcPr>
-            <w:tcW w:type="dxa" w:w="3213"/>
+            <w:tcW w:type="dxa" w:w="4365"/>
+            <w:vAlign w:val="center"/>
+            <w:shd w:fill="172A3A"/>
+            <w:tcMar>
+              <w:top w:w="100" w:type="dxa"/>
+              <w:bottom w:w="100" w:type="dxa"/>
+              <w:left w:w="120" w:type="dxa"/>
+              <w:right w:w="120" w:type="dxa"/>
+            </w:tcMar>
           </w:tcPr>
           <w:p>
             <w:pPr>
+              <w:keepNext/>
               <w:spacing w:after="100" w:line="264" w:lineRule="auto"/>
             </w:pPr>
             <w:r>
               <w:rPr>
+                <w:color w:val="FFFFFF"/>
                 <w:sz w:val="18"/>
               </w:rPr>
               <w:t>解释</w:t>
@@ -1870,7 +2766,15 @@
         </w:trPr>
         <w:tc>
           <w:tcPr>
-            <w:tcW w:type="dxa" w:w="3213"/>
+            <w:tcW w:type="dxa" w:w="2154"/>
+            <w:vAlign w:val="center"/>
+            <w:shd w:fill="F3F6F8"/>
+            <w:tcMar>
+              <w:top w:w="100" w:type="dxa"/>
+              <w:bottom w:w="100" w:type="dxa"/>
+              <w:left w:w="120" w:type="dxa"/>
+              <w:right w:w="120" w:type="dxa"/>
+            </w:tcMar>
           </w:tcPr>
           <w:p>
             <w:pPr>
@@ -1878,6 +2782,7 @@
             </w:pPr>
             <w:r>
               <w:rPr>
+                <w:color w:val="000000"/>
                 <w:sz w:val="18"/>
               </w:rPr>
               <w:t>问数开发验收</w:t>
@@ -1886,7 +2791,15 @@
         </w:tc>
         <w:tc>
           <w:tcPr>
-            <w:tcW w:type="dxa" w:w="3213"/>
+            <w:tcW w:type="dxa" w:w="3118"/>
+            <w:vAlign w:val="center"/>
+            <w:shd w:fill="F3F6F8"/>
+            <w:tcMar>
+              <w:top w:w="100" w:type="dxa"/>
+              <w:bottom w:w="100" w:type="dxa"/>
+              <w:left w:w="120" w:type="dxa"/>
+              <w:right w:w="120" w:type="dxa"/>
+            </w:tcMar>
           </w:tcPr>
           <w:p>
             <w:pPr>
@@ -1894,6 +2807,7 @@
             </w:pPr>
             <w:r>
               <w:rPr>
+                <w:color w:val="000000"/>
                 <w:sz w:val="18"/>
               </w:rPr>
               <w:t>12/12</w:t>
@@ -1902,7 +2816,15 @@
         </w:tc>
         <w:tc>
           <w:tcPr>
-            <w:tcW w:type="dxa" w:w="3213"/>
+            <w:tcW w:type="dxa" w:w="4365"/>
+            <w:vAlign w:val="center"/>
+            <w:shd w:fill="F3F6F8"/>
+            <w:tcMar>
+              <w:top w:w="100" w:type="dxa"/>
+              <w:bottom w:w="100" w:type="dxa"/>
+              <w:left w:w="120" w:type="dxa"/>
+              <w:right w:w="120" w:type="dxa"/>
+            </w:tcMar>
           </w:tcPr>
           <w:p>
             <w:pPr>
@@ -1910,6 +2832,7 @@
             </w:pPr>
             <w:r>
               <w:rPr>
+                <w:color w:val="000000"/>
                 <w:sz w:val="18"/>
               </w:rPr>
               <w:t>规则规划、合成开发题</w:t>
@@ -1923,7 +2846,15 @@
         </w:trPr>
         <w:tc>
           <w:tcPr>
-            <w:tcW w:type="dxa" w:w="3213"/>
+            <w:tcW w:type="dxa" w:w="2154"/>
+            <w:vAlign w:val="center"/>
+            <w:shd w:fill="FFFFFF"/>
+            <w:tcMar>
+              <w:top w:w="100" w:type="dxa"/>
+              <w:bottom w:w="100" w:type="dxa"/>
+              <w:left w:w="120" w:type="dxa"/>
+              <w:right w:w="120" w:type="dxa"/>
+            </w:tcMar>
           </w:tcPr>
           <w:p>
             <w:pPr>
@@ -1931,6 +2862,7 @@
             </w:pPr>
             <w:r>
               <w:rPr>
+                <w:color w:val="000000"/>
                 <w:sz w:val="18"/>
               </w:rPr>
               <w:t>多格式问答开发验收</w:t>
@@ -1939,7 +2871,15 @@
         </w:tc>
         <w:tc>
           <w:tcPr>
-            <w:tcW w:type="dxa" w:w="3213"/>
+            <w:tcW w:type="dxa" w:w="3118"/>
+            <w:vAlign w:val="center"/>
+            <w:shd w:fill="FFFFFF"/>
+            <w:tcMar>
+              <w:top w:w="100" w:type="dxa"/>
+              <w:bottom w:w="100" w:type="dxa"/>
+              <w:left w:w="120" w:type="dxa"/>
+              <w:right w:w="120" w:type="dxa"/>
+            </w:tcMar>
           </w:tcPr>
           <w:p>
             <w:pPr>
@@ -1947,6 +2887,7 @@
             </w:pPr>
             <w:r>
               <w:rPr>
+                <w:color w:val="000000"/>
                 <w:sz w:val="18"/>
               </w:rPr>
               <w:t>11/11</w:t>
@@ -1955,7 +2896,15 @@
         </w:tc>
         <w:tc>
           <w:tcPr>
-            <w:tcW w:type="dxa" w:w="3213"/>
+            <w:tcW w:type="dxa" w:w="4365"/>
+            <w:vAlign w:val="center"/>
+            <w:shd w:fill="FFFFFF"/>
+            <w:tcMar>
+              <w:top w:w="100" w:type="dxa"/>
+              <w:bottom w:w="100" w:type="dxa"/>
+              <w:left w:w="120" w:type="dxa"/>
+              <w:right w:w="120" w:type="dxa"/>
+            </w:tcMar>
           </w:tcPr>
           <w:p>
             <w:pPr>
@@ -1963,6 +2912,7 @@
             </w:pPr>
             <w:r>
               <w:rPr>
+                <w:color w:val="000000"/>
                 <w:sz w:val="18"/>
               </w:rPr>
               <w:t>混合检索、原文摘录与引用核对</w:t>
@@ -1976,7 +2926,15 @@
         </w:trPr>
         <w:tc>
           <w:tcPr>
-            <w:tcW w:type="dxa" w:w="3213"/>
+            <w:tcW w:type="dxa" w:w="2154"/>
+            <w:vAlign w:val="center"/>
+            <w:shd w:fill="F3F6F8"/>
+            <w:tcMar>
+              <w:top w:w="100" w:type="dxa"/>
+              <w:bottom w:w="100" w:type="dxa"/>
+              <w:left w:w="120" w:type="dxa"/>
+              <w:right w:w="120" w:type="dxa"/>
+            </w:tcMar>
           </w:tcPr>
           <w:p>
             <w:pPr>
@@ -1984,6 +2942,7 @@
             </w:pPr>
             <w:r>
               <w:rPr>
+                <w:color w:val="000000"/>
                 <w:sz w:val="18"/>
               </w:rPr>
               <w:t>跨源工具链开发验收</w:t>
@@ -1992,7 +2951,15 @@
         </w:tc>
         <w:tc>
           <w:tcPr>
-            <w:tcW w:type="dxa" w:w="3213"/>
+            <w:tcW w:type="dxa" w:w="3118"/>
+            <w:vAlign w:val="center"/>
+            <w:shd w:fill="F3F6F8"/>
+            <w:tcMar>
+              <w:top w:w="100" w:type="dxa"/>
+              <w:bottom w:w="100" w:type="dxa"/>
+              <w:left w:w="120" w:type="dxa"/>
+              <w:right w:w="120" w:type="dxa"/>
+            </w:tcMar>
           </w:tcPr>
           <w:p>
             <w:pPr>
@@ -2000,6 +2967,7 @@
             </w:pPr>
             <w:r>
               <w:rPr>
+                <w:color w:val="000000"/>
                 <w:sz w:val="18"/>
               </w:rPr>
               <w:t>5/5</w:t>
@@ -2008,7 +2976,15 @@
         </w:tc>
         <w:tc>
           <w:tcPr>
-            <w:tcW w:type="dxa" w:w="3213"/>
+            <w:tcW w:type="dxa" w:w="4365"/>
+            <w:vAlign w:val="center"/>
+            <w:shd w:fill="F3F6F8"/>
+            <w:tcMar>
+              <w:top w:w="100" w:type="dxa"/>
+              <w:bottom w:w="100" w:type="dxa"/>
+              <w:left w:w="120" w:type="dxa"/>
+              <w:right w:w="120" w:type="dxa"/>
+            </w:tcMar>
           </w:tcPr>
           <w:p>
             <w:pPr>
@@ -2016,6 +2992,7 @@
             </w:pPr>
             <w:r>
               <w:rPr>
+                <w:color w:val="000000"/>
                 <w:sz w:val="18"/>
               </w:rPr>
               <w:t>明确工具计划，非未知模型规划</w:t>
@@ -2029,7 +3006,15 @@
         </w:trPr>
         <w:tc>
           <w:tcPr>
-            <w:tcW w:type="dxa" w:w="3213"/>
+            <w:tcW w:type="dxa" w:w="2154"/>
+            <w:vAlign w:val="center"/>
+            <w:shd w:fill="FFFFFF"/>
+            <w:tcMar>
+              <w:top w:w="100" w:type="dxa"/>
+              <w:bottom w:w="100" w:type="dxa"/>
+              <w:left w:w="120" w:type="dxa"/>
+              <w:right w:w="120" w:type="dxa"/>
+            </w:tcMar>
           </w:tcPr>
           <w:p>
             <w:pPr>
@@ -2037,6 +3022,7 @@
             </w:pPr>
             <w:r>
               <w:rPr>
+                <w:color w:val="000000"/>
                 <w:sz w:val="18"/>
               </w:rPr>
               <w:t>公开Chinook开发题</w:t>
@@ -2045,7 +3031,15 @@
         </w:tc>
         <w:tc>
           <w:tcPr>
-            <w:tcW w:type="dxa" w:w="3213"/>
+            <w:tcW w:type="dxa" w:w="3118"/>
+            <w:vAlign w:val="center"/>
+            <w:shd w:fill="FFFFFF"/>
+            <w:tcMar>
+              <w:top w:w="100" w:type="dxa"/>
+              <w:bottom w:w="100" w:type="dxa"/>
+              <w:left w:w="120" w:type="dxa"/>
+              <w:right w:w="120" w:type="dxa"/>
+            </w:tcMar>
           </w:tcPr>
           <w:p>
             <w:pPr>
@@ -2053,6 +3047,7 @@
             </w:pPr>
             <w:r>
               <w:rPr>
+                <w:color w:val="000000"/>
                 <w:sz w:val="18"/>
               </w:rPr>
               <w:t>12/12</w:t>
@@ -2061,7 +3056,15 @@
         </w:tc>
         <w:tc>
           <w:tcPr>
-            <w:tcW w:type="dxa" w:w="3213"/>
+            <w:tcW w:type="dxa" w:w="4365"/>
+            <w:vAlign w:val="center"/>
+            <w:shd w:fill="FFFFFF"/>
+            <w:tcMar>
+              <w:top w:w="100" w:type="dxa"/>
+              <w:bottom w:w="100" w:type="dxa"/>
+              <w:left w:w="120" w:type="dxa"/>
+              <w:right w:w="120" w:type="dxa"/>
+            </w:tcMar>
           </w:tcPr>
           <w:p>
             <w:pPr>
@@ -2069,6 +3072,7 @@
             </w:pPr>
             <w:r>
               <w:rPr>
+                <w:color w:val="000000"/>
                 <w:sz w:val="18"/>
               </w:rPr>
               <w:t>公开库，人工题，非Spider基准</w:t>
@@ -2082,7 +3086,15 @@
         </w:trPr>
         <w:tc>
           <w:tcPr>
-            <w:tcW w:type="dxa" w:w="3213"/>
+            <w:tcW w:type="dxa" w:w="2154"/>
+            <w:vAlign w:val="center"/>
+            <w:shd w:fill="F3F6F8"/>
+            <w:tcMar>
+              <w:top w:w="100" w:type="dxa"/>
+              <w:bottom w:w="100" w:type="dxa"/>
+              <w:left w:w="120" w:type="dxa"/>
+              <w:right w:w="120" w:type="dxa"/>
+            </w:tcMar>
           </w:tcPr>
           <w:p>
             <w:pPr>
@@ -2090,6 +3102,87 @@
             </w:pPr>
             <w:r>
               <w:rPr>
+                <w:color w:val="000000"/>
+                <w:sz w:val="18"/>
+              </w:rPr>
+              <w:t>实际故障开发审计</w:t>
+            </w:r>
+          </w:p>
+        </w:tc>
+        <w:tc>
+          <w:tcPr>
+            <w:tcW w:type="dxa" w:w="3118"/>
+            <w:vAlign w:val="center"/>
+            <w:shd w:fill="F3F6F8"/>
+            <w:tcMar>
+              <w:top w:w="100" w:type="dxa"/>
+              <w:bottom w:w="100" w:type="dxa"/>
+              <w:left w:w="120" w:type="dxa"/>
+              <w:right w:w="120" w:type="dxa"/>
+            </w:tcMar>
+          </w:tcPr>
+          <w:p>
+            <w:pPr>
+              <w:spacing w:after="100" w:line="264" w:lineRule="auto"/>
+            </w:pPr>
+            <w:r>
+              <w:rPr>
+                <w:color w:val="000000"/>
+                <w:sz w:val="18"/>
+              </w:rPr>
+              <w:t>4/10 → 10/10</w:t>
+            </w:r>
+          </w:p>
+        </w:tc>
+        <w:tc>
+          <w:tcPr>
+            <w:tcW w:type="dxa" w:w="4365"/>
+            <w:vAlign w:val="center"/>
+            <w:shd w:fill="F3F6F8"/>
+            <w:tcMar>
+              <w:top w:w="100" w:type="dxa"/>
+              <w:bottom w:w="100" w:type="dxa"/>
+              <w:left w:w="120" w:type="dxa"/>
+              <w:right w:w="120" w:type="dxa"/>
+            </w:tcMar>
+          </w:tcPr>
+          <w:p>
+            <w:pPr>
+              <w:spacing w:after="100" w:line="264" w:lineRule="auto"/>
+            </w:pPr>
+            <w:r>
+              <w:rPr>
+                <w:color w:val="000000"/>
+                <w:sz w:val="18"/>
+              </w:rPr>
+              <w:t>临时文件/数据库/HTTP子服务，首次失败保留</w:t>
+            </w:r>
+          </w:p>
+        </w:tc>
+      </w:tr>
+      <w:tr>
+        <w:trPr>
+          <w:cantSplit/>
+        </w:trPr>
+        <w:tc>
+          <w:tcPr>
+            <w:tcW w:type="dxa" w:w="2154"/>
+            <w:vAlign w:val="center"/>
+            <w:shd w:fill="FFFFFF"/>
+            <w:tcMar>
+              <w:top w:w="100" w:type="dxa"/>
+              <w:bottom w:w="100" w:type="dxa"/>
+              <w:left w:w="120" w:type="dxa"/>
+              <w:right w:w="120" w:type="dxa"/>
+            </w:tcMar>
+          </w:tcPr>
+          <w:p>
+            <w:pPr>
+              <w:spacing w:after="100" w:line="264" w:lineRule="auto"/>
+            </w:pPr>
+            <w:r>
+              <w:rPr>
+                <w:color w:val="000000"/>
                 <w:sz w:val="18"/>
               </w:rPr>
               <w:t>真实gpt-6-luna</w:t>
@@ -2098,7 +3191,15 @@
         </w:tc>
         <w:tc>
           <w:tcPr>
-            <w:tcW w:type="dxa" w:w="3213"/>
+            <w:tcW w:type="dxa" w:w="3118"/>
+            <w:vAlign w:val="center"/>
+            <w:shd w:fill="FFFFFF"/>
+            <w:tcMar>
+              <w:top w:w="100" w:type="dxa"/>
+              <w:bottom w:w="100" w:type="dxa"/>
+              <w:left w:w="120" w:type="dxa"/>
+              <w:right w:w="120" w:type="dxa"/>
+            </w:tcMar>
           </w:tcPr>
           <w:p>
             <w:pPr>
@@ -2106,6 +3207,7 @@
             </w:pPr>
             <w:r>
               <w:rPr>
+                <w:color w:val="000000"/>
                 <w:sz w:val="18"/>
               </w:rPr>
               <w:t>authentication_failed</w:t>
@@ -2114,7 +3216,15 @@
         </w:tc>
         <w:tc>
           <w:tcPr>
-            <w:tcW w:type="dxa" w:w="3213"/>
+            <w:tcW w:type="dxa" w:w="4365"/>
+            <w:vAlign w:val="center"/>
+            <w:shd w:fill="FFFFFF"/>
+            <w:tcMar>
+              <w:top w:w="100" w:type="dxa"/>
+              <w:bottom w:w="100" w:type="dxa"/>
+              <w:left w:w="120" w:type="dxa"/>
+              <w:right w:w="120" w:type="dxa"/>
+            </w:tcMar>
           </w:tcPr>
           <w:p>
             <w:pPr>
@@ -2122,6 +3232,7 @@
             </w:pPr>
             <w:r>
               <w:rPr>
+                <w:color w:val="000000"/>
                 <w:sz w:val="18"/>
               </w:rPr>
               <w:t>models及responses探测401，未有模型成绩</w:t>
@@ -2135,7 +3246,15 @@
         <w:spacing w:after="160" w:line="300" w:lineRule="auto"/>
       </w:pPr>
       <w:r>
-        <w:t>本地391项回归覆盖接口、安全、语义与拒绝路径；一个Starlette弃用警告不影响当前通过，但需在依赖升级时处理。</w:t>
+        <w:t>本地468项回归覆盖接口、安全、语义与拒绝路径；一个Starlette弃用警告不影响当前通过，但需在依赖升级时处理。</w:t>
+      </w:r>
+    </w:p>
+    <w:p>
+      <w:pPr>
+        <w:spacing w:after="160" w:line="300" w:lineRule="auto"/>
+      </w:pPr>
+      <w:r>
+        <w:t>同一组十项实际临时副本故障首次4/10，修复后10/10；原文件篡改或缺失停止旧切片与公式链，SQL缺库/锁定停止后步，硬kill子服务重启后五轮和pending澄清继续，会话锁503后解锁保留原历史。仅为开发审计，不代表掉电容灾。</w:t>
       </w:r>
     </w:p>
     <w:p>
@@ -2160,20 +3279,29 @@
         <w:spacing w:after="160" w:line="300" w:lineRule="auto"/>
       </w:pPr>
       <w:r>
-        <w:t>效率、成本与工程取舍</w:t>
+        <w:t>效率 成本与工程取舍</w:t>
       </w:r>
     </w:p>
     <w:tbl>
       <w:tblPr>
         <w:tblStyle w:val="LightShading-Accent1"/>
         <w:tblW w:type="auto" w:w="0"/>
+        <w:tblLayout w:type="fixed"/>
         <w:tblLook w:firstColumn="1" w:firstRow="1" w:lastColumn="0" w:lastRow="0" w:noHBand="0" w:noVBand="1" w:val="04A0"/>
+        <w:tblBorders>
+          <w:top w:val="single" w:sz="4" w:color="D9D9D9"/>
+          <w:left w:val="single" w:sz="4" w:color="D9D9D9"/>
+          <w:bottom w:val="single" w:sz="4" w:color="D9D9D9"/>
+          <w:right w:val="single" w:sz="4" w:color="D9D9D9"/>
+          <w:insideH w:val="single" w:sz="4" w:color="D9D9D9"/>
+          <w:insideV w:val="single" w:sz="4" w:color="D9D9D9"/>
+        </w:tblBorders>
       </w:tblPr>
       <w:tblGrid>
-        <w:gridCol w:w="2409"/>
-        <w:gridCol w:w="2409"/>
-        <w:gridCol w:w="2409"/>
-        <w:gridCol w:w="2409"/>
+        <w:gridCol w:w="1701"/>
+        <w:gridCol w:w="1701"/>
+        <w:gridCol w:w="3118"/>
+        <w:gridCol w:w="3118"/>
       </w:tblGrid>
       <w:tr>
         <w:trPr>
@@ -2182,14 +3310,24 @@
         </w:trPr>
         <w:tc>
           <w:tcPr>
-            <w:tcW w:type="dxa" w:w="2409"/>
+            <w:tcW w:type="dxa" w:w="1701"/>
+            <w:vAlign w:val="center"/>
+            <w:shd w:fill="172A3A"/>
+            <w:tcMar>
+              <w:top w:w="100" w:type="dxa"/>
+              <w:bottom w:w="100" w:type="dxa"/>
+              <w:left w:w="120" w:type="dxa"/>
+              <w:right w:w="120" w:type="dxa"/>
+            </w:tcMar>
           </w:tcPr>
           <w:p>
             <w:pPr>
+              <w:keepNext/>
               <w:spacing w:after="100" w:line="264" w:lineRule="auto"/>
             </w:pPr>
             <w:r>
               <w:rPr>
+                <w:color w:val="FFFFFF"/>
                 <w:sz w:val="18"/>
               </w:rPr>
               <w:t>PDF页数</w:t>
@@ -2198,14 +3336,24 @@
         </w:tc>
         <w:tc>
           <w:tcPr>
-            <w:tcW w:type="dxa" w:w="2409"/>
+            <w:tcW w:type="dxa" w:w="1701"/>
+            <w:vAlign w:val="center"/>
+            <w:shd w:fill="172A3A"/>
+            <w:tcMar>
+              <w:top w:w="100" w:type="dxa"/>
+              <w:bottom w:w="100" w:type="dxa"/>
+              <w:left w:w="120" w:type="dxa"/>
+              <w:right w:w="120" w:type="dxa"/>
+            </w:tcMar>
           </w:tcPr>
           <w:p>
             <w:pPr>
+              <w:keepNext/>
               <w:spacing w:after="100" w:line="264" w:lineRule="auto"/>
             </w:pPr>
             <w:r>
               <w:rPr>
+                <w:color w:val="FFFFFF"/>
                 <w:sz w:val="18"/>
               </w:rPr>
               <w:t>切片数</w:t>
@@ -2214,14 +3362,24 @@
         </w:tc>
         <w:tc>
           <w:tcPr>
-            <w:tcW w:type="dxa" w:w="2409"/>
+            <w:tcW w:type="dxa" w:w="3118"/>
+            <w:vAlign w:val="center"/>
+            <w:shd w:fill="172A3A"/>
+            <w:tcMar>
+              <w:top w:w="100" w:type="dxa"/>
+              <w:bottom w:w="100" w:type="dxa"/>
+              <w:left w:w="120" w:type="dxa"/>
+              <w:right w:w="120" w:type="dxa"/>
+            </w:tcMar>
           </w:tcPr>
           <w:p>
             <w:pPr>
+              <w:keepNext/>
               <w:spacing w:after="100" w:line="264" w:lineRule="auto"/>
             </w:pPr>
             <w:r>
               <w:rPr>
+                <w:color w:val="FFFFFF"/>
                 <w:sz w:val="18"/>
               </w:rPr>
               <w:t>全局语义热P50/ms</w:t>
@@ -2230,14 +3388,24 @@
         </w:tc>
         <w:tc>
           <w:tcPr>
-            <w:tcW w:type="dxa" w:w="2409"/>
+            <w:tcW w:type="dxa" w:w="3118"/>
+            <w:vAlign w:val="center"/>
+            <w:shd w:fill="172A3A"/>
+            <w:tcMar>
+              <w:top w:w="100" w:type="dxa"/>
+              <w:bottom w:w="100" w:type="dxa"/>
+              <w:left w:w="120" w:type="dxa"/>
+              <w:right w:w="120" w:type="dxa"/>
+            </w:tcMar>
           </w:tcPr>
           <w:p>
             <w:pPr>
+              <w:keepNext/>
               <w:spacing w:after="100" w:line="264" w:lineRule="auto"/>
             </w:pPr>
             <w:r>
               <w:rPr>
+                <w:color w:val="FFFFFF"/>
                 <w:sz w:val="18"/>
               </w:rPr>
               <w:t>全局语义热P95/ms</w:t>
@@ -2251,7 +3419,15 @@
         </w:trPr>
         <w:tc>
           <w:tcPr>
-            <w:tcW w:type="dxa" w:w="2409"/>
+            <w:tcW w:type="dxa" w:w="1701"/>
+            <w:vAlign w:val="center"/>
+            <w:shd w:fill="F3F6F8"/>
+            <w:tcMar>
+              <w:top w:w="100" w:type="dxa"/>
+              <w:bottom w:w="100" w:type="dxa"/>
+              <w:left w:w="120" w:type="dxa"/>
+              <w:right w:w="120" w:type="dxa"/>
+            </w:tcMar>
           </w:tcPr>
           <w:p>
             <w:pPr>
@@ -2259,6 +3435,7 @@
             </w:pPr>
             <w:r>
               <w:rPr>
+                <w:color w:val="000000"/>
                 <w:sz w:val="18"/>
               </w:rPr>
               <w:t>10</w:t>
@@ -2267,7 +3444,15 @@
         </w:tc>
         <w:tc>
           <w:tcPr>
-            <w:tcW w:type="dxa" w:w="2409"/>
+            <w:tcW w:type="dxa" w:w="1701"/>
+            <w:vAlign w:val="center"/>
+            <w:shd w:fill="F3F6F8"/>
+            <w:tcMar>
+              <w:top w:w="100" w:type="dxa"/>
+              <w:bottom w:w="100" w:type="dxa"/>
+              <w:left w:w="120" w:type="dxa"/>
+              <w:right w:w="120" w:type="dxa"/>
+            </w:tcMar>
           </w:tcPr>
           <w:p>
             <w:pPr>
@@ -2275,6 +3460,7 @@
             </w:pPr>
             <w:r>
               <w:rPr>
+                <w:color w:val="000000"/>
                 <w:sz w:val="18"/>
               </w:rPr>
               <w:t>50</w:t>
@@ -2283,7 +3469,15 @@
         </w:tc>
         <w:tc>
           <w:tcPr>
-            <w:tcW w:type="dxa" w:w="2409"/>
+            <w:tcW w:type="dxa" w:w="3118"/>
+            <w:vAlign w:val="center"/>
+            <w:shd w:fill="F3F6F8"/>
+            <w:tcMar>
+              <w:top w:w="100" w:type="dxa"/>
+              <w:bottom w:w="100" w:type="dxa"/>
+              <w:left w:w="120" w:type="dxa"/>
+              <w:right w:w="120" w:type="dxa"/>
+            </w:tcMar>
           </w:tcPr>
           <w:p>
             <w:pPr>
@@ -2291,15 +3485,24 @@
             </w:pPr>
             <w:r>
               <w:rPr>
+                <w:color w:val="000000"/>
                 <w:sz w:val="18"/>
               </w:rPr>
-              <w:t>19.093</w:t>
+              <w:t>21.154</w:t>
             </w:r>
           </w:p>
         </w:tc>
         <w:tc>
           <w:tcPr>
-            <w:tcW w:type="dxa" w:w="2409"/>
+            <w:tcW w:type="dxa" w:w="3118"/>
+            <w:vAlign w:val="center"/>
+            <w:shd w:fill="F3F6F8"/>
+            <w:tcMar>
+              <w:top w:w="100" w:type="dxa"/>
+              <w:bottom w:w="100" w:type="dxa"/>
+              <w:left w:w="120" w:type="dxa"/>
+              <w:right w:w="120" w:type="dxa"/>
+            </w:tcMar>
           </w:tcPr>
           <w:p>
             <w:pPr>
@@ -2307,9 +3510,10 @@
             </w:pPr>
             <w:r>
               <w:rPr>
+                <w:color w:val="000000"/>
                 <w:sz w:val="18"/>
               </w:rPr>
-              <w:t>19.575</w:t>
+              <w:t>21.897</w:t>
             </w:r>
           </w:p>
         </w:tc>
@@ -2320,7 +3524,15 @@
         </w:trPr>
         <w:tc>
           <w:tcPr>
-            <w:tcW w:type="dxa" w:w="2409"/>
+            <w:tcW w:type="dxa" w:w="1701"/>
+            <w:vAlign w:val="center"/>
+            <w:shd w:fill="FFFFFF"/>
+            <w:tcMar>
+              <w:top w:w="100" w:type="dxa"/>
+              <w:bottom w:w="100" w:type="dxa"/>
+              <w:left w:w="120" w:type="dxa"/>
+              <w:right w:w="120" w:type="dxa"/>
+            </w:tcMar>
           </w:tcPr>
           <w:p>
             <w:pPr>
@@ -2328,6 +3540,7 @@
             </w:pPr>
             <w:r>
               <w:rPr>
+                <w:color w:val="000000"/>
                 <w:sz w:val="18"/>
               </w:rPr>
               <w:t>100</w:t>
@@ -2336,7 +3549,15 @@
         </w:tc>
         <w:tc>
           <w:tcPr>
-            <w:tcW w:type="dxa" w:w="2409"/>
+            <w:tcW w:type="dxa" w:w="1701"/>
+            <w:vAlign w:val="center"/>
+            <w:shd w:fill="FFFFFF"/>
+            <w:tcMar>
+              <w:top w:w="100" w:type="dxa"/>
+              <w:bottom w:w="100" w:type="dxa"/>
+              <w:left w:w="120" w:type="dxa"/>
+              <w:right w:w="120" w:type="dxa"/>
+            </w:tcMar>
           </w:tcPr>
           <w:p>
             <w:pPr>
@@ -2344,6 +3565,7 @@
             </w:pPr>
             <w:r>
               <w:rPr>
+                <w:color w:val="000000"/>
                 <w:sz w:val="18"/>
               </w:rPr>
               <w:t>500</w:t>
@@ -2352,7 +3574,15 @@
         </w:tc>
         <w:tc>
           <w:tcPr>
-            <w:tcW w:type="dxa" w:w="2409"/>
+            <w:tcW w:type="dxa" w:w="3118"/>
+            <w:vAlign w:val="center"/>
+            <w:shd w:fill="FFFFFF"/>
+            <w:tcMar>
+              <w:top w:w="100" w:type="dxa"/>
+              <w:bottom w:w="100" w:type="dxa"/>
+              <w:left w:w="120" w:type="dxa"/>
+              <w:right w:w="120" w:type="dxa"/>
+            </w:tcMar>
           </w:tcPr>
           <w:p>
             <w:pPr>
@@ -2360,15 +3590,24 @@
             </w:pPr>
             <w:r>
               <w:rPr>
+                <w:color w:val="000000"/>
                 <w:sz w:val="18"/>
               </w:rPr>
-              <w:t>109.542</w:t>
+              <w:t>113.635</w:t>
             </w:r>
           </w:p>
         </w:tc>
         <w:tc>
           <w:tcPr>
-            <w:tcW w:type="dxa" w:w="2409"/>
+            <w:tcW w:type="dxa" w:w="3118"/>
+            <w:vAlign w:val="center"/>
+            <w:shd w:fill="FFFFFF"/>
+            <w:tcMar>
+              <w:top w:w="100" w:type="dxa"/>
+              <w:bottom w:w="100" w:type="dxa"/>
+              <w:left w:w="120" w:type="dxa"/>
+              <w:right w:w="120" w:type="dxa"/>
+            </w:tcMar>
           </w:tcPr>
           <w:p>
             <w:pPr>
@@ -2376,9 +3615,10 @@
             </w:pPr>
             <w:r>
               <w:rPr>
+                <w:color w:val="000000"/>
                 <w:sz w:val="18"/>
               </w:rPr>
-              <w:t>115.637</w:t>
+              <w:t>134.712</w:t>
             </w:r>
           </w:p>
         </w:tc>
@@ -2389,7 +3629,15 @@
         </w:trPr>
         <w:tc>
           <w:tcPr>
-            <w:tcW w:type="dxa" w:w="2409"/>
+            <w:tcW w:type="dxa" w:w="1701"/>
+            <w:vAlign w:val="center"/>
+            <w:shd w:fill="F3F6F8"/>
+            <w:tcMar>
+              <w:top w:w="100" w:type="dxa"/>
+              <w:bottom w:w="100" w:type="dxa"/>
+              <w:left w:w="120" w:type="dxa"/>
+              <w:right w:w="120" w:type="dxa"/>
+            </w:tcMar>
           </w:tcPr>
           <w:p>
             <w:pPr>
@@ -2397,6 +3645,7 @@
             </w:pPr>
             <w:r>
               <w:rPr>
+                <w:color w:val="000000"/>
                 <w:sz w:val="18"/>
               </w:rPr>
               <w:t>500</w:t>
@@ -2405,7 +3654,15 @@
         </w:tc>
         <w:tc>
           <w:tcPr>
-            <w:tcW w:type="dxa" w:w="2409"/>
+            <w:tcW w:type="dxa" w:w="1701"/>
+            <w:vAlign w:val="center"/>
+            <w:shd w:fill="F3F6F8"/>
+            <w:tcMar>
+              <w:top w:w="100" w:type="dxa"/>
+              <w:bottom w:w="100" w:type="dxa"/>
+              <w:left w:w="120" w:type="dxa"/>
+              <w:right w:w="120" w:type="dxa"/>
+            </w:tcMar>
           </w:tcPr>
           <w:p>
             <w:pPr>
@@ -2413,6 +3670,7 @@
             </w:pPr>
             <w:r>
               <w:rPr>
+                <w:color w:val="000000"/>
                 <w:sz w:val="18"/>
               </w:rPr>
               <w:t>2500</w:t>
@@ -2421,7 +3679,15 @@
         </w:tc>
         <w:tc>
           <w:tcPr>
-            <w:tcW w:type="dxa" w:w="2409"/>
+            <w:tcW w:type="dxa" w:w="3118"/>
+            <w:vAlign w:val="center"/>
+            <w:shd w:fill="F3F6F8"/>
+            <w:tcMar>
+              <w:top w:w="100" w:type="dxa"/>
+              <w:bottom w:w="100" w:type="dxa"/>
+              <w:left w:w="120" w:type="dxa"/>
+              <w:right w:w="120" w:type="dxa"/>
+            </w:tcMar>
           </w:tcPr>
           <w:p>
             <w:pPr>
@@ -2429,15 +3695,24 @@
             </w:pPr>
             <w:r>
               <w:rPr>
+                <w:color w:val="000000"/>
                 <w:sz w:val="18"/>
               </w:rPr>
-              <w:t>541.472</w:t>
+              <w:t>523.822</w:t>
             </w:r>
           </w:p>
         </w:tc>
         <w:tc>
           <w:tcPr>
-            <w:tcW w:type="dxa" w:w="2409"/>
+            <w:tcW w:type="dxa" w:w="3118"/>
+            <w:vAlign w:val="center"/>
+            <w:shd w:fill="F3F6F8"/>
+            <w:tcMar>
+              <w:top w:w="100" w:type="dxa"/>
+              <w:bottom w:w="100" w:type="dxa"/>
+              <w:left w:w="120" w:type="dxa"/>
+              <w:right w:w="120" w:type="dxa"/>
+            </w:tcMar>
           </w:tcPr>
           <w:p>
             <w:pPr>
@@ -2445,9 +3720,10 @@
             </w:pPr>
             <w:r>
               <w:rPr>
+                <w:color w:val="000000"/>
                 <w:sz w:val="18"/>
               </w:rPr>
-              <w:t>616.101</w:t>
+              <w:t>618.806</w:t>
             </w:r>
           </w:p>
         </w:tc>
@@ -2458,7 +3734,7 @@
         <w:spacing w:after="160" w:line="300" w:lineRule="auto"/>
       </w:pPr>
       <w:r>
-        <w:t>以上是实际文字PDF入库后的混合检索与摘录答案，不含OCR与外部生成。500页首次全局回答约16.1秒，说明冷启动编码成本必须单列。明确编号快速查询不代表一般语义查询延迟。</w:t>
+        <w:t>以上是实际文字PDF入库后的混合检索与摘录答案，不含OCR与外部生成。500页全局语义热P50=523.822ms、P95=618.806ms，首次全局回答5.390s。首次全局编码、首载模型与热缓存分别报告；当前首次全局并不是新进程完整冷启动。编号查询不代表一般语义延迟。</w:t>
       </w:r>
     </w:p>
     <w:p>
@@ -2909,7 +4185,7 @@
     <w:rsid w:val="00FC693F"/>
     <w:rPr>
       <w:rFonts w:ascii="Microsoft YaHei" w:hAnsi="Microsoft YaHei" w:eastAsia="Microsoft YaHei"/>
-      <w:color w:val="172A3A"/>
+      <w:color w:val="000000"/>
       <w:sz w:val="22"/>
     </w:rPr>
   </w:style>
@@ -2975,7 +4251,7 @@
       <w:rFonts w:asciiTheme="majorHAnsi" w:eastAsiaTheme="majorEastAsia" w:hAnsiTheme="majorHAnsi" w:cstheme="majorBidi" w:ascii="Microsoft YaHei" w:hAnsi="Microsoft YaHei" w:eastAsia="Microsoft YaHei"/>
       <w:b/>
       <w:bCs/>
-      <w:color w:val="172A3A"/>
+      <w:color w:val="000000"/>
       <w:sz w:val="38"/>
       <w:szCs w:val="28"/>
     </w:rPr>
@@ -2999,7 +4275,7 @@
       <w:rFonts w:asciiTheme="majorHAnsi" w:eastAsiaTheme="majorEastAsia" w:hAnsiTheme="majorHAnsi" w:cstheme="majorBidi" w:ascii="Microsoft YaHei" w:hAnsi="Microsoft YaHei" w:eastAsia="Microsoft YaHei"/>
       <w:b/>
       <w:bCs/>
-      <w:color w:val="172A3A"/>
+      <w:color w:val="000000"/>
       <w:sz w:val="24"/>
       <w:szCs w:val="26"/>
     </w:rPr>
@@ -3254,15 +4530,12 @@
     <w:qFormat/>
     <w:rsid w:val="00FC693F"/>
     <w:pPr>
-      <w:pBdr>
-        <w:bottom w:val="single" w:sz="8" w:space="4" w:color="4F81BD" w:themeColor="accent1"/>
-      </w:pBdr>
       <w:spacing w:after="300" w:line="240" w:lineRule="auto"/>
       <w:contextualSpacing/>
     </w:pPr>
     <w:rPr>
       <w:rFonts w:asciiTheme="majorHAnsi" w:eastAsiaTheme="majorEastAsia" w:hAnsiTheme="majorHAnsi" w:cstheme="majorBidi" w:ascii="Microsoft YaHei" w:hAnsi="Microsoft YaHei" w:eastAsia="Microsoft YaHei"/>
-      <w:color w:val="172A3A"/>
+      <w:color w:val="000000"/>
       <w:spacing w:val="5"/>
       <w:kern w:val="28"/>
       <w:sz w:val="60"/>
@@ -3301,7 +4574,7 @@
       <w:rFonts w:asciiTheme="majorHAnsi" w:eastAsiaTheme="majorEastAsia" w:hAnsiTheme="majorHAnsi" w:cstheme="majorBidi" w:ascii="Microsoft YaHei" w:hAnsi="Microsoft YaHei" w:eastAsia="Microsoft YaHei"/>
       <w:i/>
       <w:iCs/>
-      <w:color w:val="172A3A"/>
+      <w:color w:val="000000"/>
       <w:spacing w:val="15"/>
       <w:sz w:val="24"/>
       <w:szCs w:val="24"/>

</xml_diff>

<commit_message>
Audit model calls and verify sourced threshold comparisons
</commit_message>
<xml_diff>
--- a/delivery/01-design-report.docx
+++ b/delivery/01-design-report.docx
@@ -1525,7 +1525,7 @@
                 <w:color w:val="000000"/>
                 <w:sz w:val="18"/>
               </w:rPr>
-              <w:t>低质OCR恢复</w:t>
+              <w:t>文档质量综合评估</w:t>
             </w:r>
           </w:p>
         </w:tc>
@@ -1550,7 +1550,7 @@
                 <w:color w:val="000000"/>
                 <w:sz w:val="18"/>
               </w:rPr>
-              <w:t>10种合成扰动，原图8/10→增强10/10</w:t>
+              <w:t>OCR8/10→10/10；繁体/错字待验收</w:t>
             </w:r>
           </w:p>
         </w:tc>
@@ -2608,7 +2608,7 @@
                 <w:color w:val="000000"/>
                 <w:sz w:val="18"/>
               </w:rPr>
-              <w:t>文档检索→Excel阈值→比较</w:t>
+              <w:t>检索→来源事实→Excel→le比较</w:t>
             </w:r>
           </w:p>
         </w:tc>
@@ -2633,7 +2633,7 @@
                 <w:color w:val="000000"/>
                 <w:sz w:val="18"/>
               </w:rPr>
-              <w:t>来源与数值</w:t>
+              <w:t>原文、数值与单位</w:t>
             </w:r>
           </w:p>
         </w:tc>
@@ -3246,7 +3246,7 @@
         <w:spacing w:after="160" w:line="300" w:lineRule="auto"/>
       </w:pPr>
       <w:r>
-        <w:t>本地468项回归覆盖接口、安全、语义与拒绝路径；一个Starlette弃用警告不影响当前通过，但需在依赖升级时处理。</w:t>
+        <w:t>本地524项回归覆盖接口、安全、语义与拒绝路径；一个Starlette弃用警告不影响当前通过，但需在依赖升级时处理。</w:t>
       </w:r>
     </w:p>
     <w:p>

</xml_diff>